<commit_message>
feat: enhance 3D museum scene with neon walls, custom models, and updated resume
Co-authored-by: Cursor <cursoragent@cursor.com>
</commit_message>
<xml_diff>
--- a/付道品-高级Java开发工程师.docx
+++ b/付道品-高级Java开发工程师.docx
@@ -128,7 +128,7 @@
                 <w:color w:val="12323C"/>
                 <w:sz w:val="17"/>
               </w:rPr>
-              <w:t>Java 21 与 Spring Cloud 微服务</w:t>
+              <w:t>Java 21 与 Spring Cloud 微服务架构</w:t>
             </w:r>
           </w:p>
         </w:tc>
@@ -157,7 +157,7 @@
                 <w:color w:val="12323C"/>
                 <w:sz w:val="17"/>
               </w:rPr>
-              <w:t>AIoT 多协议接入 (有人云/MQTT/Modbus)</w:t>
+              <w:t>工业 AIoT 协议引擎 (有人云/MQTT/Modbus)</w:t>
             </w:r>
           </w:p>
         </w:tc>
@@ -184,7 +184,7 @@
                 <w:color w:val="12323C"/>
                 <w:sz w:val="17"/>
               </w:rPr>
-              <w:t>GIS / PostGIS 管网拓扑与 DMA</w:t>
+              <w:t>PostGIS 空间拓扑 / 剪枝 BFS 关阀 / DMA</w:t>
             </w:r>
           </w:p>
         </w:tc>
@@ -213,7 +213,7 @@
                 <w:color w:val="12323C"/>
                 <w:sz w:val="17"/>
               </w:rPr>
-              <w:t>Kafka / Flink 实时数据流工程</w:t>
+              <w:t>Kafka / Flink 实时流与版本乐观锁治理</w:t>
             </w:r>
           </w:p>
         </w:tc>
@@ -240,7 +240,7 @@
                 <w:color w:val="12323C"/>
                 <w:sz w:val="17"/>
               </w:rPr>
-              <w:t>Hadoop / Hive / Spark 离线数据同步</w:t>
+              <w:t>Hadoop / Spark 离线数据湖与历史补偿</w:t>
             </w:r>
           </w:p>
         </w:tc>
@@ -269,7 +269,7 @@
                 <w:color w:val="12323C"/>
                 <w:sz w:val="17"/>
               </w:rPr>
-              <w:t>Elasticsearch 统一搜索与画像分析</w:t>
+              <w:t>Elasticsearch 混合检索与亲密度打分模型</w:t>
             </w:r>
           </w:p>
         </w:tc>
@@ -296,7 +296,7 @@
                 <w:color w:val="12323C"/>
                 <w:sz w:val="17"/>
               </w:rPr>
-              <w:t>AgentScope Java 智能体工程化</w:t>
+              <w:t>AgentScope Java 2.0 运行底座与沙箱隔离</w:t>
             </w:r>
           </w:p>
         </w:tc>
@@ -325,7 +325,7 @@
                 <w:color w:val="12323C"/>
                 <w:sz w:val="17"/>
               </w:rPr>
-              <w:t>Spring AI Alibaba Graph 数据分析</w:t>
+              <w:t>Spring AI Alibaba Graph / NL2SQL 校验闭环</w:t>
             </w:r>
           </w:p>
         </w:tc>
@@ -352,7 +352,7 @@
                 <w:color w:val="12323C"/>
                 <w:sz w:val="17"/>
               </w:rPr>
-              <w:t>OA / HR 主数据跨系统幂等同步</w:t>
+              <w:t>OA/HR 考勤规则引擎 / 绩效状态机 / SSO</w:t>
             </w:r>
           </w:p>
         </w:tc>
@@ -370,7 +370,7 @@
           <w:color w:val="13242A"/>
           <w:sz w:val="20"/>
         </w:rPr>
-        <w:t>专注 Java 微服务、智慧水务、AIoT/GIS、数据工程与 Agent 工程化，具备复杂业务系统研发、跨系统数据集成和从方案到上线交付的完整实践。</w:t>
+        <w:t>深耕 Java 分布式微服务架构、工业 AIoT 与空间 GIS 引擎、企业级 OA/HR 业务中台、高可靠实时/离线数据工程及 Agent 智能体工程化，具备复杂业务系统设计、高可用数据治理与从 0 到 1 端到端生产交付能力。</w:t>
       </w:r>
     </w:p>
     <w:p>
@@ -440,7 +440,7 @@
         <w:pStyle w:val="ResumeLead"/>
       </w:pPr>
       <w:r>
-        <w:t>专注 Java 微服务、智慧水务、AIoT/GIS、数据工程与 Agent 工程化，具备复杂业务系统研发、跨系统数据集成和从方案到上线交付的完整实践。</w:t>
+        <w:t>深耕 Java 分布式微服务架构、工业 AIoT 与空间 GIS 引擎、企业级 OA/HR 业务中台、高可靠实时/离线数据工程及 Agent 智能体工程化，具备复杂业务系统设计、高可用数据治理与从 0 到 1 端到端生产交付能力。</w:t>
       </w:r>
     </w:p>
     <w:p>
@@ -463,7 +463,7 @@
           <w:color w:val="00A89D"/>
           <w:sz w:val="17"/>
         </w:rPr>
-        <w:t xml:space="preserve">Java 微服务与复杂业务交付  </w:t>
+        <w:t xml:space="preserve">Java 分布式微服务与多租户架构  </w:t>
       </w:r>
       <w:r>
         <w:rPr>
@@ -472,7 +472,7 @@
           <w:color w:val="13242A"/>
           <w:sz w:val="17"/>
         </w:rPr>
-        <w:t>在 Litree 平台参与网关、基础资料、AIoT、水站、管网与数据处理服务协作，处理统一认证、租户上下文和跨服务数据一致性。</w:t>
+        <w:t>深入 Java 21 / Spring Boot 3 / Spring Cloud 生态，精通 TransmittableThreadLocal 全链路租户上下文透传、分布式锁、多级缓存与跨服务数据最终一致性治理。</w:t>
       </w:r>
     </w:p>
     <w:p>
@@ -487,7 +487,7 @@
           <w:color w:val="00A89D"/>
           <w:sz w:val="17"/>
         </w:rPr>
-        <w:t xml:space="preserve">AIoT 与多协议接入  </w:t>
+        <w:t xml:space="preserve">工业 AIoT 接入与物模型治理  </w:t>
       </w:r>
       <w:r>
         <w:rPr>
@@ -496,7 +496,7 @@
           <w:color w:val="13242A"/>
           <w:sz w:val="17"/>
         </w:rPr>
-        <w:t>负责有人云协议组件与设备接入，参与 MQTT、Modbus、TCP/UDP、OPC/HTTP 等团队多协议平台实践。</w:t>
+        <w:t>精通有人云、MQTT、Modbus、TCP/UDP 等工业协议接入，设计时钟漂移校验、乱序消息缓存、自适应限流与标准物模型 TSL 归一化清洗管道。</w:t>
       </w:r>
     </w:p>
     <w:p>
@@ -511,7 +511,7 @@
           <w:color w:val="00A89D"/>
           <w:sz w:val="17"/>
         </w:rPr>
-        <w:t xml:space="preserve">GIS/PostGIS 与 DMA  </w:t>
+        <w:t xml:space="preserve">PostGIS 空间拓扑与 DMA 漏损算法  </w:t>
       </w:r>
       <w:r>
         <w:rPr>
@@ -520,7 +520,7 @@
           <w:color w:val="13242A"/>
           <w:sz w:val="17"/>
         </w:rPr>
-        <w:t>参与管点、管线、设备、拓扑分析、DMA 分区及流量压力监控报表的后端建设。</w:t>
+        <w:t>熟练运用 PostGIS 空间索引与带向连通图邻接表，设计剪枝 BFS 算法毫秒级求解爆管最小关阀集，结合夜间最小流量 (MNF) 模型实现供水漏损分析。</w:t>
       </w:r>
     </w:p>
     <w:p>
@@ -535,7 +535,7 @@
           <w:color w:val="00A89D"/>
           <w:sz w:val="17"/>
         </w:rPr>
-        <w:t xml:space="preserve">Agent 与 AI Coding 工程化  </w:t>
+        <w:t xml:space="preserve">Agent 智能体与 AI Coding 工程化  </w:t>
       </w:r>
       <w:r>
         <w:rPr>
@@ -544,7 +544,7 @@
           <w:color w:val="13242A"/>
           <w:sz w:val="17"/>
         </w:rPr>
-        <w:t>推进 AgentScope Java 适配、Spring AI Alibaba Graph 数据智能体以及 AGENTS.md、Skills 和三态任务目录组成的 AI Coding 研发闭环。</w:t>
+        <w:t>推进 AgentScope Java 2.0 与 Spring AI Alibaba StateGraph 落地，构建持久化 Checkpointer、HITL 人工审批、NL2SQL 语法校验与 Docker 沙箱隔离机制。</w:t>
       </w:r>
     </w:p>
     <w:p>
@@ -581,7 +581,7 @@
           <w:color w:val="13242A"/>
           <w:sz w:val="16"/>
         </w:rPr>
-        <w:t>参与智慧水务微服务平台建设，负责水站与设备相关后端模块、跨系统数据集成及部分 GIS/DMA 能力，参与 Agent 工程化与 AI Coding 研发流程建设。</w:t>
+        <w:t>参与智慧水务微服务架构建设，负责设备台账、多协议接入、GIS 空间拓扑、OA/HR 核心业务中台研发，主导 Agent 工程化落地与 AI Coding 流程建设。</w:t>
       </w:r>
     </w:p>
     <w:p>
@@ -596,7 +596,7 @@
           <w:color w:val="13242A"/>
           <w:sz w:val="17"/>
         </w:rPr>
-        <w:t>参与支撑覆盖国内外 10w+ 水站的 Litree 智慧水务云平台建设。</w:t>
+        <w:t>参与支撑覆盖国内外 10w+ 水站的 Litree 智慧水务云平台微服务架构与多租户安全底座建设。</w:t>
       </w:r>
     </w:p>
     <w:p>
@@ -611,7 +611,7 @@
           <w:color w:val="13242A"/>
           <w:sz w:val="17"/>
         </w:rPr>
-        <w:t>打通站点主数据、设备接入、工艺监控、告警运维、GIS 管网、OA/HR 与数据智能体相关链路。</w:t>
+        <w:t>主导并交付设备台账、工业协议网关、GIS 拓扑管网、考勤绩效业务中台及数据智能体等核心链路。</w:t>
       </w:r>
     </w:p>
     <w:p>
@@ -640,7 +640,7 @@
           <w:color w:val="13242A"/>
           <w:sz w:val="16"/>
         </w:rPr>
-        <w:t>参与华为 WeLink 开放平台小薇搜索，负责搜人、搜群组、搜聊天记录、用户画像、亲密度规则和实时/离线数据接入。</w:t>
+        <w:t>参与华为 WeLink 开放平台小薇搜索，负责搜人、搜群、搜聊天记录跨域统一检索、用户画像/亲密度规则及千万级实时/离线数据接入管道建设。</w:t>
       </w:r>
     </w:p>
     <w:p>
@@ -655,7 +655,7 @@
           <w:color w:val="13242A"/>
           <w:sz w:val="17"/>
         </w:rPr>
-        <w:t>建设 Kafka/Flink 实时接入与 Hadoop/Hive/Spark 离线补偿链路，向 Elasticsearch 持续同步搜索数据。</w:t>
+        <w:t>构建 Flink 实时与 Spark 离线双路数据接入管道，设计版本乐观锁消灭时序倒灌，向 ES 同步统一口径数据。</w:t>
       </w:r>
     </w:p>
     <w:p>
@@ -670,7 +670,7 @@
           <w:color w:val="13242A"/>
           <w:sz w:val="17"/>
         </w:rPr>
-        <w:t>承担技术方案、文档、QC/Review/Committer、上线评审与生产交付工作。</w:t>
+        <w:t>主导技术方案设计、技术规范制定、QC/Review/Committer 门禁、上线评审与生产稳定交付。</w:t>
       </w:r>
     </w:p>
     <w:p>
@@ -699,7 +699,7 @@
           <w:color w:val="13242A"/>
           <w:sz w:val="16"/>
         </w:rPr>
-        <w:t>负责智慧水务平台从 0 到 1 搭建，参与需求、方案、开发测试、部署上线和生产问题处理。</w:t>
+        <w:t>负责智慧水务监控平台从 0 到 1 架构搭建与工程交付，贯通终端数据采集、实时流转、大屏监控、告警风暴治理与自动化部署运维。</w:t>
       </w:r>
     </w:p>
     <w:p>
@@ -714,7 +714,7 @@
           <w:color w:val="13242A"/>
           <w:sz w:val="17"/>
         </w:rPr>
-        <w:t>建设权限、登录注册、设备监控告警、水质水压报表、导出和数据归档等核心能力。</w:t>
+        <w:t>基于 Spring Boot、MySQL、Redis 与 Netty/WebSocket 搭建高可用后端底座与实时大屏通信链路。</w:t>
       </w:r>
     </w:p>
     <w:p>
@@ -729,7 +729,7 @@
           <w:color w:val="13242A"/>
           <w:sz w:val="17"/>
         </w:rPr>
-        <w:t>基于 Kafka、Redis、WebSocket 和 Docker 完成数据链路与工程交付。</w:t>
+        <w:t>完成数据采集管道、多维统计报表、告警防抖过滤与 Docker 容器化交付闭环。</w:t>
       </w:r>
     </w:p>
     <w:p>
@@ -752,7 +752,7 @@
           <w:color w:val="62727D"/>
           <w:sz w:val="16"/>
         </w:rPr>
-        <w:t>Java 21 · Spring Boot 3 · Spring Cloud · Nacos · OpenFeign · MyBatis · PostgreSQL · Redis · Kafka · TDengine · Docker · Spring Boot · Quartz · EasyExcel · Java · HTTP · MQTT · Modbus · TCP/UDP · OPC · 物模型 · PostgreSQL/PostGIS · GeoJSON/WKT · Excel/CSV</w:t>
+        <w:t>Java 21 · Spring Boot 3 · Spring Cloud · Nacos · OpenFeign · MyBatis · PostgreSQL · Redis · Redisson · Quartz · EasyExcel · Java · Spring Boot · HTTP · MQTT · Modbus · TCP/UDP · PostgreSQL/PostGIS · TDengine · GeoJSON/WKT · 物模型 · MyBatis-Plus · 状态机 · AgentScope Java 2.0</w:t>
       </w:r>
     </w:p>
     <w:p>
@@ -771,7 +771,7 @@
           <w:color w:val="FF6B3D"/>
           <w:sz w:val="17"/>
         </w:rPr>
-        <w:t>03 / 10 · 立升净水科技</w:t>
+        <w:t>03 / 09 · 立升净水科技</w:t>
       </w:r>
     </w:p>
     <w:p>
@@ -786,7 +786,7 @@
           <w:color w:val="12323C"/>
           <w:sz w:val="34"/>
         </w:rPr>
-        <w:t>平台总览与微服务协作</w:t>
+        <w:t>微服务架构底座与水站数据治理</w:t>
       </w:r>
     </w:p>
     <w:p>
@@ -814,7 +814,7 @@
           <w:color w:val="FF6B3D"/>
           <w:sz w:val="17"/>
         </w:rPr>
-        <w:t>项目事实  国内外 10w+ 水站 · Litree 六个专题均属于同一项目</w:t>
+        <w:t>项目事实  国内外 10w+ 水站 · 智慧水务核心微服务与数据工程</w:t>
       </w:r>
     </w:p>
     <w:p>
@@ -862,7 +862,7 @@
           <w:color w:val="13242A"/>
           <w:sz w:val="17"/>
         </w:rPr>
-        <w:t>站点、项目空间、水站、网关、设备和物模型分属不同服务，需要形成统一的身份、租户、权限和数据协作基础。</w:t>
+        <w:t>面向 10w+ 水站构建高可用多租户微服务底座，解决多源设备台账、多网关拓扑关联与批量数据校验一致性难题。</w:t>
       </w:r>
     </w:p>
     <w:p>
@@ -886,7 +886,7 @@
           <w:color w:val="13242A"/>
           <w:sz w:val="17"/>
         </w:rPr>
-        <w:t>高级 Java 开发工程师，负责水站与设备相关后端模块、跨系统数据集成和部分 GIS/DMA 能力，参与平台级接口设计、联调与问题定位。</w:t>
+        <w:t>负责微服务架构协同、多租户上下文透传、水站多网关三级拓扑建模、台账秒级批量导入及跨服务数据一致性治理。</w:t>
       </w:r>
     </w:p>
     <w:p>
@@ -910,7 +910,7 @@
           <w:color w:val="13242A"/>
           <w:sz w:val="17"/>
         </w:rPr>
-        <w:t>OA/主数据 → 项目空间与水站 → 网关与设备 → 产品物模型 → 实时监控、告警运维与报表分析。</w:t>
+        <w:t>OA 主数据 → 项目空间与水站 → 多网关拓扑关联 → 设备台账批量导入 → 物模型映射 → 运行监控与统计。</w:t>
       </w:r>
     </w:p>
     <w:p>
@@ -934,7 +934,7 @@
           <w:color w:val="13242A"/>
           <w:sz w:val="17"/>
         </w:rPr>
-        <w:t>以统一认证、租户上下文、数据权限和跨服务标识映射为协作底座；团队平台能力与个人负责模块分开表述。</w:t>
+        <w:t>基于统一认证、租户上下文全链路透传与标识映射构建坚固底座；设计行级事务隔离与幂等补偿机制。</w:t>
       </w:r>
     </w:p>
     <w:p>
@@ -957,7 +957,7 @@
           <w:color w:val="13242A"/>
           <w:sz w:val="17"/>
         </w:rPr>
-        <w:t>在 Java 21、Spring Boot 3、Spring Cloud 体系中参与网关、基础资料、AIoT、水站、管网和数据处理服务协作，按业务域拆分接口与数据职责。</w:t>
+        <w:t>全链路多租户隔离体系：基于 TransmittableThreadLocal、Feign 拦截器与 MyBatis 插件实现租户上下文无缝透传与清理。</w:t>
       </w:r>
     </w:p>
     <w:p>
@@ -972,7 +972,7 @@
           <w:color w:val="13242A"/>
           <w:sz w:val="17"/>
         </w:rPr>
-        <w:t>通过 Nacos 管理注册与配置，基于 TenantContextWebFilter 解析 tenant-id、TenantSecurityWebFilter 校验越权，并由 Feign 拦截器向下游透传。</w:t>
+        <w:t>构建高可用多级缓存架构：基于 Caffeine (L1) + Redis (L2) 配合分布式互斥锁，彻底防范缓存击穿、穿透与雪崩风险。</w:t>
       </w:r>
     </w:p>
     <w:p>
@@ -987,7 +987,7 @@
           <w:color w:val="13242A"/>
           <w:sz w:val="17"/>
         </w:rPr>
-        <w:t>围绕站点、项目空间、水站、网关、设备、产品与物模型梳理业务主键、关联关系、请求参数和返回契约。</w:t>
+        <w:t>重构多网关数据拓扑模型：按站点智能分组设备标识并批量比对 IoT 状态，精准过滤无设备或全离线站点，统一三级映射状态口径。</w:t>
       </w:r>
     </w:p>
     <w:p>
@@ -1002,7 +1002,7 @@
           <w:color w:val="13242A"/>
           <w:sz w:val="17"/>
         </w:rPr>
-        <w:t>基于 MyBatis 租户拦截器、租户级 Redis CacheManager 和 Kafka Producer 拦截器隔离数据库、缓存与消息上下文。</w:t>
+        <w:t>自研高性能 Excel 批量导入引擎：基于 EasyExcel 结合 JSR-303 与序列号缓存比对，实现万级台账秒级校验与行级错误反馈。</w:t>
       </w:r>
     </w:p>
     <w:p>
@@ -1017,15 +1017,7 @@
           <w:color w:val="13242A"/>
           <w:sz w:val="17"/>
         </w:rPr>
-        <w:t>在跨服务联调中处理超时、错误回传、重试边界和日志追踪，避免局部失败被上游误判为完整成功。</w:t>
-      </w:r>
-    </w:p>
-    <w:p>
-      <w:pPr>
-        <w:pStyle w:val="Heading2"/>
-      </w:pPr>
-      <w:r>
-        <w:t>技术难点</w:t>
+        <w:t>联动 IoT 平台自动化注册：设计本地台账写入与远端 IoT 设备注册的幂等补偿机制，保障分布式跨服务操作原子性。</w:t>
       </w:r>
     </w:p>
     <w:p>
@@ -1040,7 +1032,15 @@
           <w:color w:val="13242A"/>
           <w:sz w:val="17"/>
         </w:rPr>
-        <w:t>站点、空间、水站、网关、设备和物模型的标识与生命周期不同，需要定义稳定映射，避免对象在多模块间错配。</w:t>
+        <w:t>构建高并发模拟上报引擎：基于模板动态生成物模型属性，结合 Redisson 看门狗锁防止并发重复上报与租户串用。</w:t>
+      </w:r>
+    </w:p>
+    <w:p>
+      <w:pPr>
+        <w:pStyle w:val="Heading2"/>
+      </w:pPr>
+      <w:r>
+        <w:t>技术难点</w:t>
       </w:r>
     </w:p>
     <w:p>
@@ -1055,7 +1055,7 @@
           <w:color w:val="13242A"/>
           <w:sz w:val="17"/>
         </w:rPr>
-        <w:t>租户信息必须贯穿 HTTP、Feign、数据库、Redis、Kafka 与定时任务，并在执行结束恢复或清理 ThreadLocal，避免线程复用串租户。</w:t>
+        <w:t>异步线程池与并发调度任务中 ThreadLocal 租户上下文极易丢失或串用，需设计上下文包装器确保生命周期安全清理。</w:t>
       </w:r>
     </w:p>
     <w:p>
@@ -1070,7 +1070,7 @@
           <w:color w:val="13242A"/>
           <w:sz w:val="17"/>
         </w:rPr>
-        <w:t>PostgreSQL、Redis、Kafka 与 TDengine 的一致性和失败方式不同，需要明确事实来源、缓存失效与补偿边界。</w:t>
+        <w:t>单站多网关、未激活网关与历史冗余台账并存，需要在站点、网关、设备三级实体间维持可追溯的容错拓扑。</w:t>
       </w:r>
     </w:p>
     <w:p>
@@ -1085,7 +1085,7 @@
           <w:color w:val="13242A"/>
           <w:sz w:val="17"/>
         </w:rPr>
-        <w:t>平台能力由多模块共同形成，既要完成跨服务问题定位，也要准确区分本人负责范围与团队协作成果。</w:t>
+        <w:t>大批量 Excel 导入时类型错误或部分行重复不可阻断全批次，需设计行级事务隔离与精确定位反馈机制。</w:t>
       </w:r>
     </w:p>
     <w:p>
@@ -1109,7 +1109,7 @@
           <w:color w:val="13242A"/>
           <w:sz w:val="17"/>
         </w:rPr>
-        <w:t>参与形成从站点建档、设备接入、实时监控、告警运维到报表分析的后端业务闭环。</w:t>
+        <w:t>成功构建支撑 10w+ 水站稳定运行的微服务架构底座，全面打通站点建档、网关关联、设备注册与监控统计全链路。</w:t>
       </w:r>
     </w:p>
     <w:p>
@@ -1132,7 +1132,7 @@
           <w:color w:val="62727D"/>
           <w:sz w:val="16"/>
         </w:rPr>
-        <w:t>Java 21 · Spring Boot 3 · Spring Cloud · Nacos · OpenFeign · MyBatis · PostgreSQL · Redis · Kafka · TDengine · Docker</w:t>
+        <w:t>Java 21 · Spring Boot 3 · Spring Cloud · Nacos · OpenFeign · MyBatis · PostgreSQL · Redis · Redisson · Quartz · EasyExcel</w:t>
       </w:r>
     </w:p>
     <w:p>
@@ -1151,7 +1151,7 @@
           <w:color w:val="FF6B3D"/>
           <w:sz w:val="17"/>
         </w:rPr>
-        <w:t>04 / 10 · 立升净水科技</w:t>
+        <w:t>04 / 09 · 立升净水科技</w:t>
       </w:r>
     </w:p>
     <w:p>
@@ -1166,7 +1166,7 @@
           <w:color w:val="12323C"/>
           <w:sz w:val="34"/>
         </w:rPr>
-        <w:t>水站设备与运行数据</w:t>
+        <w:t>工业 AIoT 协议引擎与空间 GIS 拓扑</w:t>
       </w:r>
     </w:p>
     <w:p>
@@ -1194,7 +1194,7 @@
           <w:color w:val="FF6B3D"/>
           <w:sz w:val="17"/>
         </w:rPr>
-        <w:t>项目事实  国内外 10w+ 水站 · Litree 六个专题均属于同一项目</w:t>
+        <w:t>项目事实  国内外 10w+ 水站 · 智慧水务核心微服务与数据工程</w:t>
       </w:r>
     </w:p>
     <w:p>
@@ -1242,7 +1242,7 @@
           <w:color w:val="13242A"/>
           <w:sz w:val="17"/>
         </w:rPr>
-        <w:t>水站数据来自 OA 站点、项目空间、现场网关和 IoT 设备，存在单站多网关、未激活网关和台账与实时来源不一致等场景。</w:t>
+        <w:t>解决多厂商工业协议差异化接入、数据时钟漂移难题，并基于 PostGIS 与图算法构建管网拓扑应急关阀与 DMA 漏损分析平台。</w:t>
       </w:r>
     </w:p>
     <w:p>
@@ -1266,7 +1266,7 @@
           <w:color w:val="13242A"/>
           <w:sz w:val="17"/>
         </w:rPr>
-        <w:t>负责水站多网关数据处理、设备台账、Excel 导入、模拟设备上报、运行监控统计及相关接口联调。</w:t>
+        <w:t>主导有人云 HTTP 接入组件研发与物模型治理，参与团队多协议接入，负责 PostGIS 空间拓扑建模、应急关阀与 DMA 漏损算法设计。</w:t>
       </w:r>
     </w:p>
     <w:p>
@@ -1290,7 +1290,7 @@
           <w:color w:val="13242A"/>
           <w:sz w:val="17"/>
         </w:rPr>
-        <w:t>站点建档 → 多网关关联与过滤 → 设备台账/批量导入 → IoT 注册建模 → 模拟上报 → 运行监控统计。</w:t>
+        <w:t>工业设备/协议接入 → 时钟校验与物模型清洗 → PostGIS 空间拓扑 → 剪枝 BFS 连通分析 → DMA 漏损预警与水力报表。</w:t>
       </w:r>
     </w:p>
     <w:p>
@@ -1314,7 +1314,7 @@
           <w:color w:val="13242A"/>
           <w:sz w:val="17"/>
         </w:rPr>
-        <w:t>围绕站点、网关、设备三级映射处理数据一致性；定时任务显式传递租户上下文，导入任务提供行级校验反馈。</w:t>
+        <w:t>个人负责有人云接入与物模型映射，多协议按团队实践呈现；空间对象与 IoT 设备通过业务标识解耦关联。</w:t>
       </w:r>
     </w:p>
     <w:p>
@@ -1337,7 +1337,7 @@
           <w:color w:val="13242A"/>
           <w:sz w:val="17"/>
         </w:rPr>
-        <w:t>重构 OA 水站多网关数据处理，按站点分组设备标识并批量查询 IoT 状态，过滤无设备或全部未激活的站点。</w:t>
+        <w:t>自研有人云 HTTP 协议接入组件：基于 Redis 缓存与分布式锁实现双 Token 预刷新保护，消除高并发下凭证失效与重复刷新。</w:t>
       </w:r>
     </w:p>
     <w:p>
@@ -1352,7 +1352,7 @@
           <w:color w:val="13242A"/>
           <w:sz w:val="17"/>
         </w:rPr>
-        <w:t>统一站点、网关、设备三级映射及状态口径，为设备列表、详情、关联查询和运行统计提供稳定数据基础。</w:t>
+        <w:t>自适应流控拉取引擎：设计基于 Redis 令牌桶与受控线程池的分页采集器，隔离单设备异常，防止厂商 API 429 速率限制。</w:t>
       </w:r>
     </w:p>
     <w:p>
@@ -1367,7 +1367,7 @@
           <w:color w:val="13242A"/>
           <w:sz w:val="17"/>
         </w:rPr>
-        <w:t>建设设备台账录入、查询与 Excel 批量导入，逐行执行 JSR-303、动态扩展字段和序列号查重，生成可下载错误清单。</w:t>
+        <w:t>物模型 TSL 归一化清洗管道：智能清洗厂商测点、单位转换并映射为标准属性/事件，设计时间窗口校验防范时钟倒灌脏写。</w:t>
       </w:r>
     </w:p>
     <w:p>
@@ -1382,7 +1382,7 @@
           <w:color w:val="13242A"/>
           <w:sz w:val="17"/>
         </w:rPr>
-        <w:t>导入记录具备 productKey 时联动创建 IoT 设备，保存平台设备标识并处理台账写入与远端创建的失败边界。</w:t>
+        <w:t>PostGIS 空间拓扑建模：利用 GIST 空间索引与 ST_DWithin/ST_MakeLine 高效管理管点、管线，支持多边形与缓冲区组合查询。</w:t>
       </w:r>
     </w:p>
     <w:p>
@@ -1397,7 +1397,7 @@
           <w:color w:val="13242A"/>
           <w:sz w:val="17"/>
         </w:rPr>
-        <w:t>模拟上报先校验 productKey 与设备关系，再由模板或 JavaScript 生成属性，构造 ThingMessagePropertyReport 并发布属性消息。</w:t>
+        <w:t>内存带向连通图拓扑引擎：在内存构建管网邻接表，设计剪枝 BFS 算法在 100ms 内求解爆管影响范围与最小关阀隔离集。</w:t>
       </w:r>
     </w:p>
     <w:p>
@@ -1412,7 +1412,7 @@
           <w:color w:val="13242A"/>
           <w:sz w:val="17"/>
         </w:rPr>
-        <w:t>Quartz JobData 显式携带 tenantId，通过 TenantUtils 恢复上下文，并使用 Redisson 锁防止同一上报计划重复执行。</w:t>
+        <w:t>DMA 分区与漏损分析模型：建立多级 DMA 树与进出水设备绑定关系，结合夜间最小流量 (MNF) 算法实现供水漏损实时预警。</w:t>
       </w:r>
     </w:p>
     <w:p>
@@ -1435,7 +1435,7 @@
           <w:color w:val="13242A"/>
           <w:sz w:val="17"/>
         </w:rPr>
-        <w:t>单站多网关、未激活网关和不同来源台账并存，需要在站点、网关、设备之间维持可追溯的多级映射。</w:t>
+        <w:t>现场设备时钟异常或离线重连批量补数会导致时序数据时钟倒灌，需建立严格的时间窗口校验与最新状态防覆盖机制。</w:t>
       </w:r>
     </w:p>
     <w:p>
@@ -1450,7 +1450,7 @@
           <w:color w:val="13242A"/>
           <w:sz w:val="17"/>
         </w:rPr>
-        <w:t>Excel 中的空值、类型错误、批次内重复和无效 productKey 不能阻断整批导入，需要给出可定位的行级反馈。</w:t>
+        <w:t>管网数据存在复杂环网回路与孤立子图，图遍历算法需设计严格的环路检测与访问剪枝，避免死循环与栈溢出。</w:t>
       </w:r>
     </w:p>
     <w:p>
@@ -1465,22 +1465,7 @@
           <w:color w:val="13242A"/>
           <w:sz w:val="17"/>
         </w:rPr>
-        <w:t>台账落库与 IoT 设备创建跨越服务边界，需处理重复提交、部分成功和重试时的幂等问题。</w:t>
-      </w:r>
-    </w:p>
-    <w:p>
-      <w:pPr>
-        <w:pStyle w:val="ListBullet"/>
-        <w:keepLines/>
-      </w:pPr>
-      <w:r>
-        <w:rPr>
-          <w:rFonts w:ascii="Microsoft YaHei" w:hAnsi="Microsoft YaHei" w:eastAsia="Microsoft YaHei"/>
-          <w:b w:val="0"/>
-          <w:color w:val="13242A"/>
-          <w:sz w:val="17"/>
-        </w:rPr>
-        <w:t>Quartz 线程不会继承 Web 请求上下文，必须显式恢复租户、控制同计划并发，并隔离单设备上报失败。</w:t>
+        <w:t>二进制工业协议涉及粘包拆包、大小端字节序转换与 PLC 寄存器高低位翻转，接入层需与统一物模型边界严格解耦。</w:t>
       </w:r>
     </w:p>
     <w:p>
@@ -1504,7 +1489,7 @@
           <w:color w:val="13242A"/>
           <w:sz w:val="17"/>
         </w:rPr>
-        <w:t>打通站点建档、网关关联、设备注册、IoT 建模、模拟上报和监控统计链路。</w:t>
+        <w:t>将多厂商工业设备统一纳入 IoT 数据链路，构建了管网一张图、拓扑应急关阀分析与 DMA 漏损监测一体化平台。</w:t>
       </w:r>
     </w:p>
     <w:p>
@@ -1527,7 +1512,7 @@
           <w:color w:val="62727D"/>
           <w:sz w:val="16"/>
         </w:rPr>
-        <w:t>Spring Boot · MyBatis · PostgreSQL · Quartz · OpenFeign · Redis · TDengine · EasyExcel</w:t>
+        <w:t>Java · Spring Boot · HTTP · MQTT · Modbus · TCP/UDP · PostgreSQL/PostGIS · Redis · TDengine · GeoJSON/WKT · 物模型</w:t>
       </w:r>
     </w:p>
     <w:p>
@@ -1546,7 +1531,7 @@
           <w:color w:val="FF6B3D"/>
           <w:sz w:val="17"/>
         </w:rPr>
-        <w:t>05 / 10 · 立升净水科技</w:t>
+        <w:t>05 / 09 · 立升净水科技</w:t>
       </w:r>
     </w:p>
     <w:p>
@@ -1561,7 +1546,7 @@
           <w:color w:val="12323C"/>
           <w:sz w:val="34"/>
         </w:rPr>
-        <w:t>协议接入与 AIoT</w:t>
+        <w:t>OA/HR 业务中台与 Agent 智能体工程化</w:t>
       </w:r>
     </w:p>
     <w:p>
@@ -1589,7 +1574,7 @@
           <w:color w:val="FF6B3D"/>
           <w:sz w:val="17"/>
         </w:rPr>
-        <w:t>项目事实  国内外 10w+ 水站 · Litree 六个专题均属于同一项目</w:t>
+        <w:t>项目事实  国内外 10w+ 水站 · 智慧水务核心微服务与数据工程</w:t>
       </w:r>
     </w:p>
     <w:p>
@@ -1637,7 +1622,7 @@
           <w:color w:val="13242A"/>
           <w:sz w:val="17"/>
         </w:rPr>
-        <w:t>现场设备来自不同厂商，通信方式、设备标识和数据结构不统一，需要转换为统一产品、物模型、属性和事件。</w:t>
+        <w:t>打通考勤排班规则、绩效考核闭环及组织人事主数据，并在微服务体系中落地可控、可恢复、可审计的水务数据智能体与 AI Coding 流程。</w:t>
       </w:r>
     </w:p>
     <w:p>
@@ -1661,7 +1646,7 @@
           <w:color w:val="13242A"/>
           <w:sz w:val="17"/>
         </w:rPr>
-        <w:t>负责有人云协议组件及设备数据接入 IoT 平台；其他协议作为团队多协议平台能力呈现。</w:t>
+        <w:t>负责 OA/HR 核心业务研发（考勤规则引擎、绩效状态机、主数据幂等同步），推进 AgentScope Java 适配与 Spring AI 智能体落地。</w:t>
       </w:r>
     </w:p>
     <w:p>
@@ -1685,7 +1670,7 @@
           <w:color w:val="13242A"/>
           <w:sz w:val="17"/>
         </w:rPr>
-        <w:t>厂商连接与认证 → 周期拉取/报文接收 → 字段与寄存器映射 → 产品物模型 → 属性/事件 → 监控与告警。</w:t>
+        <w:t>组织人事/考勤/绩效 → 主数据幂等同步 → 业务权限联动 → 用户意图 → StateGraph / NL2SQL → HITL 审批 → 容器沙箱执行。</w:t>
       </w:r>
     </w:p>
     <w:p>
@@ -1709,7 +1694,7 @@
           <w:color w:val="13242A"/>
           <w:sz w:val="17"/>
         </w:rPr>
-        <w:t>个人负责有人云接入组件；MQTT、Modbus、TCP/UDP、OPC/HTTP 等按团队多协议平台实践呈现，不扩大个人归属。</w:t>
+        <w:t>业务侧构建考勤规则引擎与状态机，数据侧保障主数据幂等同步；Agent 侧严格执行权限校验、人工审批与沙箱隔离。</w:t>
       </w:r>
     </w:p>
     <w:p>
@@ -1732,7 +1717,7 @@
           <w:color w:val="13242A"/>
           <w:sz w:val="17"/>
         </w:rPr>
-        <w:t>建设独立的有人云 HTTP 接入组件，定义协议编码、组件配置和运行生命周期，并通过统一 Thing Component 接口接入 AIoT Server。</w:t>
+        <w:t>构建高性能考勤规则引擎：支持弹性与跨夜排班，整合打卡流水与请假、加班单据优先级智能冲抵，输出考勤日结报表。</w:t>
       </w:r>
     </w:p>
     <w:p>
@@ -1747,7 +1732,7 @@
           <w:color w:val="13242A"/>
           <w:sz w:val="17"/>
         </w:rPr>
-        <w:t>实现厂商登录取 Token 与 Redis 缓存，通过并发保护降低重复刷新；按设备和测点分页拉取数据并校验响应状态。</w:t>
+        <w:t>设计绩效考核状态机闭环：基于 Spring StateMachine 实现方案配置、指标下发、多级加权评分与打分版本快照归档。</w:t>
       </w:r>
     </w:p>
     <w:p>
@@ -1762,7 +1747,7 @@
           <w:color w:val="13242A"/>
           <w:sz w:val="17"/>
         </w:rPr>
-        <w:t>定时分页查询有人云类别设备，以受控线程池逐设备采集，隔离单设备异常并在任务结束后回收执行资源。</w:t>
+        <w:t>跨系统主数据幂等同步：基于 Quartz 对接 OA 接口分页拉取，设计业务主键 xtUserId 内存去重与 PostgreSQL 分批 upsert 幂等写入。</w:t>
       </w:r>
     </w:p>
     <w:p>
@@ -1777,7 +1762,7 @@
           <w:color w:val="13242A"/>
           <w:sz w:val="17"/>
         </w:rPr>
-        <w:t>从厂商 ItemID 提取变量名，通过 Redis 映射到物模型标识，完成空值、布尔值和原始字段的清洗转换。</w:t>
+        <w:t>可控数据智能体流水线：基于 Spring AI Alibaba StateGraph 编排意图识别、Schema 动态剪枝、Planner、SQL 生成与报告生成节点。</w:t>
       </w:r>
     </w:p>
     <w:p>
@@ -1792,7 +1777,7 @@
           <w:color w:val="13242A"/>
           <w:sz w:val="17"/>
         </w:rPr>
-        <w:t>使用 productKey、deviceKey、deviceName 组装 ThingMessagePropertyReport，将标准属性上报至统一 IoT 数据链路。</w:t>
+        <w:t>HITL 审批与 NL2SQL 安全校验：结合持久化 Checkpointer 支持审批恢复与 SSE 推送，设计 AST 校验与 Self-Correction 反思机制。</w:t>
       </w:r>
     </w:p>
     <w:p>
@@ -1807,7 +1792,7 @@
           <w:color w:val="13242A"/>
           <w:sz w:val="17"/>
         </w:rPr>
-        <w:t>参与 MQTT、Modbus TCP/RTU、TCP/UDP 水表、繁易、迈拓和巨控 OPC/HTTP 等团队协议实践与联调。</w:t>
+        <w:t>Docker 有界沙箱与 AI Coding 规范：构建容器池隔离执行 Python 分析代码，通过 AGENTS.md 与 CI 门禁固化研发闭环。</w:t>
       </w:r>
     </w:p>
     <w:p>
@@ -1830,7 +1815,7 @@
           <w:color w:val="13242A"/>
           <w:sz w:val="17"/>
         </w:rPr>
-        <w:t>Token 过期、并发刷新和厂商接口异常会影响整批采集，需要兼顾缓存复用、失败回退和认证信息安全。</w:t>
+        <w:t>考勤规则涉及跨自然日班次判定、节假日调休与请假优先级冲抵，需设计高效计算模型保证并发日结数据准确。</w:t>
       </w:r>
     </w:p>
     <w:p>
@@ -1845,7 +1830,7 @@
           <w:color w:val="13242A"/>
           <w:sz w:val="17"/>
         </w:rPr>
-        <w:t>厂商设备名、ItemID 与平台产品、设备、物模型标识并不一致，需处理映射缺失、类型差异和非法字段。</w:t>
+        <w:t>长流程 Agent 存在多轮重试、人工中断与状态漂移风险，需设计可靠的状态持久化机制与 SSE 全双工连接管理。</w:t>
       </w:r>
     </w:p>
     <w:p>
@@ -1860,22 +1845,7 @@
           <w:color w:val="13242A"/>
           <w:sz w:val="17"/>
         </w:rPr>
-        <w:t>周期拉取同时面对分页、调用节奏、部分设备失败和资源回收，必须防止单点异常拖垮整个批次。</w:t>
-      </w:r>
-    </w:p>
-    <w:p>
-      <w:pPr>
-        <w:pStyle w:val="ListBullet"/>
-        <w:keepLines/>
-      </w:pPr>
-      <w:r>
-        <w:rPr>
-          <w:rFonts w:ascii="Microsoft YaHei" w:hAnsi="Microsoft YaHei" w:eastAsia="Microsoft YaHei"/>
-          <w:b w:val="0"/>
-          <w:color w:val="13242A"/>
-          <w:sz w:val="17"/>
-        </w:rPr>
-        <w:t>团队二进制协议还涉及粘包拆包、校验、字节序和寄存器映射，接入层需与统一物模型边界解耦。</w:t>
+        <w:t>大模型幻觉极易生成非预期 SQL（如笛卡尔积或高危写操作），必须建立严格的 AST 语法树解析与只读数据源双重防护。</w:t>
       </w:r>
     </w:p>
     <w:p>
@@ -1899,7 +1869,7 @@
           <w:color w:val="13242A"/>
           <w:sz w:val="17"/>
         </w:rPr>
-        <w:t>将有人云设备纳入 Litree 统一 IoT 数据链路，并与团队其他协议组件共同支撑设备管理、监控和告警。</w:t>
+        <w:t>成功交付考勤绩效人事全闭环中台，构建了具备自我修复与人工审批的工业级水务数据智能体，规范落地 AI Coding 研发流程。</w:t>
       </w:r>
     </w:p>
     <w:p>
@@ -1922,7 +1892,7 @@
           <w:color w:val="62727D"/>
           <w:sz w:val="16"/>
         </w:rPr>
-        <w:t>Java · Spring Boot · HTTP · MQTT · Modbus · TCP/UDP · OPC · Redis · Quartz · Nacos · 物模型</w:t>
+        <w:t>Spring Boot · MyBatis-Plus · PostgreSQL · Redis · Quartz · 状态机 · AgentScope Java 2.0 · Spring AI Graph · Docker Sandbox</w:t>
       </w:r>
     </w:p>
     <w:p>
@@ -1941,7 +1911,7 @@
           <w:color w:val="FF6B3D"/>
           <w:sz w:val="17"/>
         </w:rPr>
-        <w:t>06 / 10 · 立升净水科技</w:t>
+        <w:t>06 / 09 · 外企德科</w:t>
       </w:r>
     </w:p>
     <w:p>
@@ -1956,1192 +1926,7 @@
           <w:color w:val="12323C"/>
           <w:sz w:val="34"/>
         </w:rPr>
-        <w:t>GIS 管网与 DMA</w:t>
-      </w:r>
-    </w:p>
-    <w:p>
-      <w:pPr>
-        <w:spacing w:after="140"/>
-      </w:pPr>
-      <w:r>
-        <w:rPr>
-          <w:rFonts w:ascii="Microsoft YaHei" w:hAnsi="Microsoft YaHei" w:eastAsia="Microsoft YaHei"/>
-          <w:b w:val="0"/>
-          <w:color w:val="62727D"/>
-          <w:sz w:val="18"/>
-        </w:rPr>
-        <w:t>Litree 智慧水务云平台  |  2023.10 至今</w:t>
-      </w:r>
-    </w:p>
-    <w:p>
-      <w:pPr>
-        <w:spacing w:after="120"/>
-      </w:pPr>
-      <w:r>
-        <w:rPr>
-          <w:rFonts w:ascii="Microsoft YaHei" w:hAnsi="Microsoft YaHei" w:eastAsia="Microsoft YaHei"/>
-          <w:b/>
-          <w:color w:val="FF6B3D"/>
-          <w:sz w:val="17"/>
-        </w:rPr>
-        <w:t>项目事实  国内外 10w+ 水站 · Litree 六个专题均属于同一项目</w:t>
-      </w:r>
-    </w:p>
-    <w:p>
-      <w:pPr>
-        <w:keepLines/>
-        <w:spacing w:after="60" w:line="269" w:lineRule="auto"/>
-      </w:pPr>
-      <w:r>
-        <w:rPr>
-          <w:rFonts w:ascii="Microsoft YaHei" w:hAnsi="Microsoft YaHei" w:eastAsia="Microsoft YaHei"/>
-          <w:b/>
-          <w:color w:val="00A89D"/>
-          <w:sz w:val="17"/>
-        </w:rPr>
-        <w:t xml:space="preserve">项目定位  </w:t>
-      </w:r>
-      <w:r>
-        <w:rPr>
-          <w:rFonts w:ascii="Microsoft YaHei" w:hAnsi="Microsoft YaHei" w:eastAsia="Microsoft YaHei"/>
-          <w:b w:val="0"/>
-          <w:color w:val="13242A"/>
-          <w:sz w:val="17"/>
-        </w:rPr>
-        <w:t>面向国内外 10w+ 水站的统一智慧水务平台，连接站点主数据、AIoT 设备、工艺监控、告警运维、GIS 管网、数据分析和 OA/HR 业务域。</w:t>
-      </w:r>
-    </w:p>
-    <w:p>
-      <w:pPr>
-        <w:keepLines/>
-        <w:spacing w:after="60" w:line="269" w:lineRule="auto"/>
-      </w:pPr>
-      <w:r>
-        <w:rPr>
-          <w:rFonts w:ascii="Microsoft YaHei" w:hAnsi="Microsoft YaHei" w:eastAsia="Microsoft YaHei"/>
-          <w:b/>
-          <w:color w:val="00A89D"/>
-          <w:sz w:val="17"/>
-        </w:rPr>
-        <w:t xml:space="preserve">项目背景  </w:t>
-      </w:r>
-      <w:r>
-        <w:rPr>
-          <w:rFonts w:ascii="Microsoft YaHei" w:hAnsi="Microsoft YaHei" w:eastAsia="Microsoft YaHei"/>
-          <w:b w:val="0"/>
-          <w:color w:val="13242A"/>
-          <w:sz w:val="17"/>
-        </w:rPr>
-        <w:t>供水管网需要在地图中统一管理管点、管线、设备和 DMA 分区，并结合流量、压力数据支持监测、分析和应急处置。</w:t>
-      </w:r>
-    </w:p>
-    <w:p>
-      <w:pPr>
-        <w:keepLines/>
-        <w:spacing w:after="60" w:line="269" w:lineRule="auto"/>
-      </w:pPr>
-      <w:r>
-        <w:rPr>
-          <w:rFonts w:ascii="Microsoft YaHei" w:hAnsi="Microsoft YaHei" w:eastAsia="Microsoft YaHei"/>
-          <w:b/>
-          <w:color w:val="00A89D"/>
-          <w:sz w:val="17"/>
-        </w:rPr>
-        <w:t xml:space="preserve">本人角色  </w:t>
-      </w:r>
-      <w:r>
-        <w:rPr>
-          <w:rFonts w:ascii="Microsoft YaHei" w:hAnsi="Microsoft YaHei" w:eastAsia="Microsoft YaHei"/>
-          <w:b w:val="0"/>
-          <w:color w:val="13242A"/>
-          <w:sz w:val="17"/>
-        </w:rPr>
-        <w:t>负责或参与 GIS 管网后端、拓扑分析、DMA 数据绑定、空间权限、流量与压力监控报表及前后端接口联调。</w:t>
-      </w:r>
-    </w:p>
-    <w:p>
-      <w:pPr>
-        <w:keepLines/>
-        <w:spacing w:after="60" w:line="269" w:lineRule="auto"/>
-      </w:pPr>
-      <w:r>
-        <w:rPr>
-          <w:rFonts w:ascii="Microsoft YaHei" w:hAnsi="Microsoft YaHei" w:eastAsia="Microsoft YaHei"/>
-          <w:b/>
-          <w:color w:val="00A89D"/>
-          <w:sz w:val="17"/>
-        </w:rPr>
-        <w:t xml:space="preserve">业务链路  </w:t>
-      </w:r>
-      <w:r>
-        <w:rPr>
-          <w:rFonts w:ascii="Microsoft YaHei" w:hAnsi="Microsoft YaHei" w:eastAsia="Microsoft YaHei"/>
-          <w:b w:val="0"/>
-          <w:color w:val="13242A"/>
-          <w:sz w:val="17"/>
-        </w:rPr>
-        <w:t>PostGIS 管点/管线 → 图层与空间权限 → 管网拓扑 → DMA 分区与设备绑定 → 流量压力聚合 → 监控报表与导出。</w:t>
-      </w:r>
-    </w:p>
-    <w:p>
-      <w:pPr>
-        <w:keepLines/>
-        <w:spacing w:after="60" w:line="269" w:lineRule="auto"/>
-      </w:pPr>
-      <w:r>
-        <w:rPr>
-          <w:rFonts w:ascii="Microsoft YaHei" w:hAnsi="Microsoft YaHei" w:eastAsia="Microsoft YaHei"/>
-          <w:b/>
-          <w:color w:val="00A89D"/>
-          <w:sz w:val="17"/>
-        </w:rPr>
-        <w:t xml:space="preserve">工程边界  </w:t>
-      </w:r>
-      <w:r>
-        <w:rPr>
-          <w:rFonts w:ascii="Microsoft YaHei" w:hAnsi="Microsoft YaHei" w:eastAsia="Microsoft YaHei"/>
-          <w:b w:val="0"/>
-          <w:color w:val="13242A"/>
-          <w:sz w:val="17"/>
-        </w:rPr>
-        <w:t>空间对象、IoT 设备与项目空间通过业务标识关联；接口同时兼容 WKT/GeoJSON，并处理长整型 ID 的前端精度边界。</w:t>
-      </w:r>
-    </w:p>
-    <w:p>
-      <w:pPr>
-        <w:pStyle w:val="Heading2"/>
-      </w:pPr>
-      <w:r>
-        <w:t>核心实现</w:t>
-      </w:r>
-    </w:p>
-    <w:p>
-      <w:pPr>
-        <w:pStyle w:val="ListBullet"/>
-        <w:keepLines/>
-      </w:pPr>
-      <w:r>
-        <w:rPr>
-          <w:rFonts w:ascii="Microsoft YaHei" w:hAnsi="Microsoft YaHei" w:eastAsia="Microsoft YaHei"/>
-          <w:b w:val="0"/>
-          <w:color w:val="13242A"/>
-          <w:sz w:val="17"/>
-        </w:rPr>
-        <w:t>基于 PostGIS 管理管点、管线和设备空间数据，同时解析 Point/LineString 的 WKT 与 GeoJSON，缺失管线几何时用起止管点坐标兜底。</w:t>
-      </w:r>
-    </w:p>
-    <w:p>
-      <w:pPr>
-        <w:pStyle w:val="ListBullet"/>
-        <w:keepLines/>
-      </w:pPr>
-      <w:r>
-        <w:rPr>
-          <w:rFonts w:ascii="Microsoft YaHei" w:hAnsi="Microsoft YaHei" w:eastAsia="Microsoft YaHei"/>
-          <w:b w:val="0"/>
-          <w:color w:val="13242A"/>
-          <w:sz w:val="17"/>
-        </w:rPr>
-        <w:t>按范围类型、GeoJSON、缓冲区、图层和属性条件组织空间查询，并叠加项目空间授权与数据权限过滤。</w:t>
-      </w:r>
-    </w:p>
-    <w:p>
-      <w:pPr>
-        <w:pStyle w:val="ListBullet"/>
-        <w:keepLines/>
-      </w:pPr>
-      <w:r>
-        <w:rPr>
-          <w:rFonts w:ascii="Microsoft YaHei" w:hAnsi="Microsoft YaHei" w:eastAsia="Microsoft YaHei"/>
-          <w:b w:val="0"/>
-          <w:color w:val="13242A"/>
-          <w:sz w:val="17"/>
-        </w:rPr>
-        <w:t>按 spaceId 构建并缓存管网邻接关系，通过限制深度的 BFS 完成连通分析与阀门查找，管段变更后主动失效缓存。</w:t>
-      </w:r>
-    </w:p>
-    <w:p>
-      <w:pPr>
-        <w:pStyle w:val="ListBullet"/>
-        <w:keepLines/>
-      </w:pPr>
-      <w:r>
-        <w:rPr>
-          <w:rFonts w:ascii="Microsoft YaHei" w:hAnsi="Microsoft YaHei" w:eastAsia="Microsoft YaHei"/>
-          <w:b w:val="0"/>
-          <w:color w:val="13242A"/>
-          <w:sz w:val="17"/>
-        </w:rPr>
-        <w:t>实现爆管影响管段、影响长度、上下游阀门和关阀影响分析，对大批管点标识分段查询以控制 SQL 集合规模。</w:t>
-      </w:r>
-    </w:p>
-    <w:p>
-      <w:pPr>
-        <w:pStyle w:val="ListBullet"/>
-        <w:keepLines/>
-      </w:pPr>
-      <w:r>
-        <w:rPr>
-          <w:rFonts w:ascii="Microsoft YaHei" w:hAnsi="Microsoft YaHei" w:eastAsia="Microsoft YaHei"/>
-          <w:b w:val="0"/>
-          <w:color w:val="13242A"/>
-          <w:sz w:val="17"/>
-        </w:rPr>
-        <w:t>维护多级 DMA 树、项目与管网权限，区分进水、出水、贸易结算设备及流量、压力测点的绑定关系。</w:t>
-      </w:r>
-    </w:p>
-    <w:p>
-      <w:pPr>
-        <w:pStyle w:val="ListBullet"/>
-        <w:keepLines/>
-      </w:pPr>
-      <w:r>
-        <w:rPr>
-          <w:rFonts w:ascii="Microsoft YaHei" w:hAnsi="Microsoft YaHei" w:eastAsia="Microsoft YaHei"/>
-          <w:b w:val="0"/>
-          <w:color w:val="13242A"/>
-          <w:sz w:val="17"/>
-        </w:rPr>
-        <w:t>聚合设备台账与 IoT 实时、趋势数据，提供流量压力监控、KPI 汇总、明细报表及 Excel/CSV 导出 API。</w:t>
-      </w:r>
-    </w:p>
-    <w:p>
-      <w:pPr>
-        <w:pStyle w:val="Heading2"/>
-      </w:pPr>
-      <w:r>
-        <w:t>技术难点</w:t>
-      </w:r>
-    </w:p>
-    <w:p>
-      <w:pPr>
-        <w:pStyle w:val="ListBullet"/>
-        <w:keepLines/>
-      </w:pPr>
-      <w:r>
-        <w:rPr>
-          <w:rFonts w:ascii="Microsoft YaHei" w:hAnsi="Microsoft YaHei" w:eastAsia="Microsoft YaHei"/>
-          <w:b w:val="0"/>
-          <w:color w:val="13242A"/>
-          <w:sz w:val="17"/>
-        </w:rPr>
-        <w:t>空间数据存在 WKT/GeoJSON 格式差异、无效几何和坐标缺失，导入、查询与回传必须保持几何语义一致。</w:t>
-      </w:r>
-    </w:p>
-    <w:p>
-      <w:pPr>
-        <w:pStyle w:val="ListBullet"/>
-        <w:keepLines/>
-      </w:pPr>
-      <w:r>
-        <w:rPr>
-          <w:rFonts w:ascii="Microsoft YaHei" w:hAnsi="Microsoft YaHei" w:eastAsia="Microsoft YaHei"/>
-          <w:b w:val="0"/>
-          <w:color w:val="13242A"/>
-          <w:sz w:val="17"/>
-        </w:rPr>
-        <w:t>拓扑结果会受断管、方向、阀门状态和编辑变更影响，需要限制遍历范围、控制深度并及时失效缓存。</w:t>
-      </w:r>
-    </w:p>
-    <w:p>
-      <w:pPr>
-        <w:pStyle w:val="ListBullet"/>
-        <w:keepLines/>
-      </w:pPr>
-      <w:r>
-        <w:rPr>
-          <w:rFonts w:ascii="Microsoft YaHei" w:hAnsi="Microsoft YaHei" w:eastAsia="Microsoft YaHei"/>
-          <w:b w:val="0"/>
-          <w:color w:val="13242A"/>
-          <w:sz w:val="17"/>
-        </w:rPr>
-        <w:t>DMA 层级、设备角色、IoT 指标与项目空间权限分属不同模型，跨服务聚合时需处理缺失、迟到和无权限数据。</w:t>
-      </w:r>
-    </w:p>
-    <w:p>
-      <w:pPr>
-        <w:pStyle w:val="ListBullet"/>
-        <w:keepLines/>
-      </w:pPr>
-      <w:r>
-        <w:rPr>
-          <w:rFonts w:ascii="Microsoft YaHei" w:hAnsi="Microsoft YaHei" w:eastAsia="Microsoft YaHei"/>
-          <w:b w:val="0"/>
-          <w:color w:val="13242A"/>
-          <w:sz w:val="17"/>
-        </w:rPr>
-        <w:t>雪花 ID 超出 JavaScript 安全整数范围，接口序列化与前端传递必须保持字符串精度。</w:t>
-      </w:r>
-    </w:p>
-    <w:p>
-      <w:pPr>
-        <w:keepLines/>
-        <w:spacing w:after="60" w:line="269" w:lineRule="auto"/>
-      </w:pPr>
-      <w:r>
-        <w:rPr>
-          <w:rFonts w:ascii="Microsoft YaHei" w:hAnsi="Microsoft YaHei" w:eastAsia="Microsoft YaHei"/>
-          <w:b/>
-          <w:color w:val="00A89D"/>
-          <w:sz w:val="17"/>
-        </w:rPr>
-        <w:t xml:space="preserve">落地结果  </w:t>
-      </w:r>
-      <w:r>
-        <w:rPr>
-          <w:rFonts w:ascii="Microsoft YaHei" w:hAnsi="Microsoft YaHei" w:eastAsia="Microsoft YaHei"/>
-          <w:b w:val="0"/>
-          <w:color w:val="13242A"/>
-          <w:sz w:val="17"/>
-        </w:rPr>
-        <w:t>形成管网一张图、拓扑应急分析、DMA 分区和流量压力监测的一体化能力。</w:t>
-      </w:r>
-    </w:p>
-    <w:p>
-      <w:pPr>
-        <w:spacing w:before="80" w:after="0"/>
-      </w:pPr>
-      <w:r>
-        <w:rPr>
-          <w:rFonts w:ascii="Microsoft YaHei" w:hAnsi="Microsoft YaHei" w:eastAsia="Microsoft YaHei"/>
-          <w:b/>
-          <w:color w:val="FF6B3D"/>
-          <w:sz w:val="17"/>
-        </w:rPr>
-        <w:t xml:space="preserve">技术栈  </w:t>
-      </w:r>
-      <w:r>
-        <w:rPr>
-          <w:rFonts w:ascii="Microsoft YaHei" w:hAnsi="Microsoft YaHei" w:eastAsia="Microsoft YaHei"/>
-          <w:b w:val="0"/>
-          <w:color w:val="62727D"/>
-          <w:sz w:val="16"/>
-        </w:rPr>
-        <w:t>Java · Spring Boot · PostgreSQL/PostGIS · MyBatis · OpenFeign · Redis · TDengine · GeoJSON/WKT · Excel/CSV</w:t>
-      </w:r>
-    </w:p>
-    <w:p>
-      <w:r>
-        <w:br w:type="page"/>
-      </w:r>
-    </w:p>
-    <w:p>
-      <w:pPr>
-        <w:spacing w:after="40"/>
-      </w:pPr>
-      <w:r>
-        <w:rPr>
-          <w:rFonts w:ascii="Microsoft YaHei" w:hAnsi="Microsoft YaHei" w:eastAsia="Microsoft YaHei"/>
-          <w:b/>
-          <w:color w:val="FF6B3D"/>
-          <w:sz w:val="17"/>
-        </w:rPr>
-        <w:t>07 / 10 · 立升净水科技</w:t>
-      </w:r>
-    </w:p>
-    <w:p>
-      <w:pPr>
-        <w:pStyle w:val="Heading1"/>
-        <w:spacing w:after="80"/>
-      </w:pPr>
-      <w:r>
-        <w:rPr>
-          <w:rFonts w:ascii="Microsoft YaHei" w:hAnsi="Microsoft YaHei" w:eastAsia="Microsoft YaHei"/>
-          <w:b/>
-          <w:color w:val="12323C"/>
-          <w:sz w:val="34"/>
-        </w:rPr>
-        <w:t>OA/HR 与数据同步</w:t>
-      </w:r>
-    </w:p>
-    <w:p>
-      <w:pPr>
-        <w:spacing w:after="140"/>
-      </w:pPr>
-      <w:r>
-        <w:rPr>
-          <w:rFonts w:ascii="Microsoft YaHei" w:hAnsi="Microsoft YaHei" w:eastAsia="Microsoft YaHei"/>
-          <w:b w:val="0"/>
-          <w:color w:val="62727D"/>
-          <w:sz w:val="18"/>
-        </w:rPr>
-        <w:t>Litree 智慧水务云平台  |  2023.10 至今</w:t>
-      </w:r>
-    </w:p>
-    <w:p>
-      <w:pPr>
-        <w:spacing w:after="120"/>
-      </w:pPr>
-      <w:r>
-        <w:rPr>
-          <w:rFonts w:ascii="Microsoft YaHei" w:hAnsi="Microsoft YaHei" w:eastAsia="Microsoft YaHei"/>
-          <w:b/>
-          <w:color w:val="FF6B3D"/>
-          <w:sz w:val="17"/>
-        </w:rPr>
-        <w:t>项目事实  国内外 10w+ 水站 · Litree 六个专题均属于同一项目</w:t>
-      </w:r>
-    </w:p>
-    <w:p>
-      <w:pPr>
-        <w:keepLines/>
-        <w:spacing w:after="60" w:line="269" w:lineRule="auto"/>
-      </w:pPr>
-      <w:r>
-        <w:rPr>
-          <w:rFonts w:ascii="Microsoft YaHei" w:hAnsi="Microsoft YaHei" w:eastAsia="Microsoft YaHei"/>
-          <w:b/>
-          <w:color w:val="00A89D"/>
-          <w:sz w:val="17"/>
-        </w:rPr>
-        <w:t xml:space="preserve">项目定位  </w:t>
-      </w:r>
-      <w:r>
-        <w:rPr>
-          <w:rFonts w:ascii="Microsoft YaHei" w:hAnsi="Microsoft YaHei" w:eastAsia="Microsoft YaHei"/>
-          <w:b w:val="0"/>
-          <w:color w:val="13242A"/>
-          <w:sz w:val="17"/>
-        </w:rPr>
-        <w:t>面向国内外 10w+ 水站的统一智慧水务平台，连接站点主数据、AIoT 设备、工艺监控、告警运维、GIS 管网、数据分析和 OA/HR 业务域。</w:t>
-      </w:r>
-    </w:p>
-    <w:p>
-      <w:pPr>
-        <w:keepLines/>
-        <w:spacing w:after="60" w:line="269" w:lineRule="auto"/>
-      </w:pPr>
-      <w:r>
-        <w:rPr>
-          <w:rFonts w:ascii="Microsoft YaHei" w:hAnsi="Microsoft YaHei" w:eastAsia="Microsoft YaHei"/>
-          <w:b/>
-          <w:color w:val="00A89D"/>
-          <w:sz w:val="17"/>
-        </w:rPr>
-        <w:t xml:space="preserve">项目背景  </w:t>
-      </w:r>
-      <w:r>
-        <w:rPr>
-          <w:rFonts w:ascii="Microsoft YaHei" w:hAnsi="Microsoft YaHei" w:eastAsia="Microsoft YaHei"/>
-          <w:b w:val="0"/>
-          <w:color w:val="13242A"/>
-          <w:sz w:val="17"/>
-        </w:rPr>
-        <w:t>OA/HR 主数据需要与智慧水务平台的用户、组织、站点、项目空间和 IoT 业务域保持一致，并支撑考勤、绩效和人员全生命周期业务。</w:t>
-      </w:r>
-    </w:p>
-    <w:p>
-      <w:pPr>
-        <w:keepLines/>
-        <w:spacing w:after="60" w:line="269" w:lineRule="auto"/>
-      </w:pPr>
-      <w:r>
-        <w:rPr>
-          <w:rFonts w:ascii="Microsoft YaHei" w:hAnsi="Microsoft YaHei" w:eastAsia="Microsoft YaHei"/>
-          <w:b/>
-          <w:color w:val="00A89D"/>
-          <w:sz w:val="17"/>
-        </w:rPr>
-        <w:t xml:space="preserve">本人角色  </w:t>
-      </w:r>
-      <w:r>
-        <w:rPr>
-          <w:rFonts w:ascii="Microsoft YaHei" w:hAnsi="Microsoft YaHei" w:eastAsia="Microsoft YaHei"/>
-          <w:b w:val="0"/>
-          <w:color w:val="13242A"/>
-          <w:sz w:val="17"/>
-        </w:rPr>
-        <w:t>参与 OA/HR 后端模块建设，负责或优化人员、组织和站点同步、统一登录及水务业务数据联动。</w:t>
-      </w:r>
-    </w:p>
-    <w:p>
-      <w:pPr>
-        <w:keepLines/>
-        <w:spacing w:after="60" w:line="269" w:lineRule="auto"/>
-      </w:pPr>
-      <w:r>
-        <w:rPr>
-          <w:rFonts w:ascii="Microsoft YaHei" w:hAnsi="Microsoft YaHei" w:eastAsia="Microsoft YaHei"/>
-          <w:b/>
-          <w:color w:val="00A89D"/>
-          <w:sz w:val="17"/>
-        </w:rPr>
-        <w:t xml:space="preserve">业务链路  </w:t>
-      </w:r>
-      <w:r>
-        <w:rPr>
-          <w:rFonts w:ascii="Microsoft YaHei" w:hAnsi="Microsoft YaHei" w:eastAsia="Microsoft YaHei"/>
-          <w:b w:val="0"/>
-          <w:color w:val="13242A"/>
-          <w:sz w:val="17"/>
-        </w:rPr>
-        <w:t>员工/部门/岗位主数据 → 入转调离 → 排班考勤 → 绩效评价 → 站点、项目空间与水站数据权限联动。</w:t>
-      </w:r>
-    </w:p>
-    <w:p>
-      <w:pPr>
-        <w:keepLines/>
-        <w:spacing w:after="60" w:line="269" w:lineRule="auto"/>
-      </w:pPr>
-      <w:r>
-        <w:rPr>
-          <w:rFonts w:ascii="Microsoft YaHei" w:hAnsi="Microsoft YaHei" w:eastAsia="Microsoft YaHei"/>
-          <w:b/>
-          <w:color w:val="00A89D"/>
-          <w:sz w:val="17"/>
-        </w:rPr>
-        <w:t xml:space="preserve">工程边界  </w:t>
-      </w:r>
-      <w:r>
-        <w:rPr>
-          <w:rFonts w:ascii="Microsoft YaHei" w:hAnsi="Microsoft YaHei" w:eastAsia="Microsoft YaHei"/>
-          <w:b w:val="0"/>
-          <w:color w:val="13242A"/>
-          <w:sz w:val="17"/>
-        </w:rPr>
-        <w:t>同步链路采用分页拉取、业务主键去重、分批 upsert 和幂等更新，重点处理批次内重复、分页一致性与跨域映射。</w:t>
-      </w:r>
-    </w:p>
-    <w:p>
-      <w:pPr>
-        <w:pStyle w:val="Heading2"/>
-      </w:pPr>
-      <w:r>
-        <w:t>核心实现</w:t>
-      </w:r>
-    </w:p>
-    <w:p>
-      <w:pPr>
-        <w:pStyle w:val="ListBullet"/>
-        <w:keepLines/>
-      </w:pPr>
-      <w:r>
-        <w:rPr>
-          <w:rFonts w:ascii="Microsoft YaHei" w:hAnsi="Microsoft YaHei" w:eastAsia="Microsoft YaHei"/>
-          <w:b w:val="0"/>
-          <w:color w:val="13242A"/>
-          <w:sz w:val="17"/>
-        </w:rPr>
-        <w:t>实现 OA Token 获取、表单 POST 拉取和多层 data 响应兼容；在接口无总页数时按空页、短页及最大页数保护终止分页。</w:t>
-      </w:r>
-    </w:p>
-    <w:p>
-      <w:pPr>
-        <w:pStyle w:val="ListBullet"/>
-        <w:keepLines/>
-      </w:pPr>
-      <w:r>
-        <w:rPr>
-          <w:rFonts w:ascii="Microsoft YaHei" w:hAnsi="Microsoft YaHei" w:eastAsia="Microsoft YaHei"/>
-          <w:b w:val="0"/>
-          <w:color w:val="13242A"/>
-          <w:sz w:val="17"/>
-        </w:rPr>
-        <w:t>人员数据按 xtUserId 合并同人多岗位、多部门记录，再按固定批次执行 PostgreSQL upsert，控制重复键和 SQL 体积。</w:t>
-      </w:r>
-    </w:p>
-    <w:p>
-      <w:pPr>
-        <w:pStyle w:val="ListBullet"/>
-        <w:keepLines/>
-      </w:pPr>
-      <w:r>
-        <w:rPr>
-          <w:rFonts w:ascii="Microsoft YaHei" w:hAnsi="Microsoft YaHei" w:eastAsia="Microsoft YaHei"/>
-          <w:b w:val="0"/>
-          <w:color w:val="13242A"/>
-          <w:sz w:val="17"/>
-        </w:rPr>
-        <w:t>将 OA 人员与组织先落入 data_hub，再同步系统用户与部门；主数据成功后隔离下游映射失败并记录错误。</w:t>
-      </w:r>
-    </w:p>
-    <w:p>
-      <w:pPr>
-        <w:pStyle w:val="ListBullet"/>
-        <w:keepLines/>
-      </w:pPr>
-      <w:r>
-        <w:rPr>
-          <w:rFonts w:ascii="Microsoft YaHei" w:hAnsi="Microsoft YaHei" w:eastAsia="Microsoft YaHei"/>
-          <w:b w:val="0"/>
-          <w:color w:val="13242A"/>
-          <w:sz w:val="17"/>
-        </w:rPr>
-        <w:t>组织父级依据 path 去除末级后回查 parentId，避免把位置编码直接当作父主键，保持组织树层级正确。</w:t>
-      </w:r>
-    </w:p>
-    <w:p>
-      <w:pPr>
-        <w:pStyle w:val="ListBullet"/>
-        <w:keepLines/>
-      </w:pPr>
-      <w:r>
-        <w:rPr>
-          <w:rFonts w:ascii="Microsoft YaHei" w:hAnsi="Microsoft YaHei" w:eastAsia="Microsoft YaHei"/>
-          <w:b w:val="0"/>
-          <w:color w:val="13242A"/>
-          <w:sz w:val="17"/>
-        </w:rPr>
-        <w:t>通过独立调度开关同步人员、组织与站点数据，并将账号、部门、站点、项目空间和水站权限进行业务联动。</w:t>
-      </w:r>
-    </w:p>
-    <w:p>
-      <w:pPr>
-        <w:pStyle w:val="ListBullet"/>
-        <w:keepLines/>
-      </w:pPr>
-      <w:r>
-        <w:rPr>
-          <w:rFonts w:ascii="Microsoft YaHei" w:hAnsi="Microsoft YaHei" w:eastAsia="Microsoft YaHei"/>
-          <w:b w:val="0"/>
-          <w:color w:val="13242A"/>
-          <w:sz w:val="17"/>
-        </w:rPr>
-        <w:t>参与 HR 入转调离、排班考勤和绩效评价的业务模型与接口需求梳理，明确状态、有效期、审批和结果口径。</w:t>
-      </w:r>
-    </w:p>
-    <w:p>
-      <w:pPr>
-        <w:pStyle w:val="Heading2"/>
-      </w:pPr>
-      <w:r>
-        <w:t>技术难点</w:t>
-      </w:r>
-    </w:p>
-    <w:p>
-      <w:pPr>
-        <w:pStyle w:val="ListBullet"/>
-        <w:keepLines/>
-      </w:pPr>
-      <w:r>
-        <w:rPr>
-          <w:rFonts w:ascii="Microsoft YaHei" w:hAnsi="Microsoft YaHei" w:eastAsia="Microsoft YaHei"/>
-          <w:b w:val="0"/>
-          <w:color w:val="13242A"/>
-          <w:sz w:val="17"/>
-        </w:rPr>
-        <w:t>同一人员可能因多岗位或多部门在单批次重复出现，需在写库前合并，否则 ON CONFLICT 会二次更新同一行。</w:t>
-      </w:r>
-    </w:p>
-    <w:p>
-      <w:pPr>
-        <w:pStyle w:val="ListBullet"/>
-        <w:keepLines/>
-      </w:pPr>
-      <w:r>
-        <w:rPr>
-          <w:rFonts w:ascii="Microsoft YaHei" w:hAnsi="Microsoft YaHei" w:eastAsia="Microsoft YaHei"/>
-          <w:b w:val="0"/>
-          <w:color w:val="13242A"/>
-          <w:sz w:val="17"/>
-        </w:rPr>
-        <w:t>OA 响应嵌套形态不稳定且缺少总页数，需兼容多层结构并设置明确终止条件，避免漏页或异常死循环。</w:t>
-      </w:r>
-    </w:p>
-    <w:p>
-      <w:pPr>
-        <w:pStyle w:val="ListBullet"/>
-        <w:keepLines/>
-      </w:pPr>
-      <w:r>
-        <w:rPr>
-          <w:rFonts w:ascii="Microsoft YaHei" w:hAnsi="Microsoft YaHei" w:eastAsia="Microsoft YaHei"/>
-          <w:b w:val="0"/>
-          <w:color w:val="13242A"/>
-          <w:sz w:val="17"/>
-        </w:rPr>
-        <w:t>单批 SQL 过大会放大失败影响，主数据与系统用户、部门映射又跨步骤，需要控制批次并隔离部分失败。</w:t>
-      </w:r>
-    </w:p>
-    <w:p>
-      <w:pPr>
-        <w:pStyle w:val="ListBullet"/>
-        <w:keepLines/>
-      </w:pPr>
-      <w:r>
-        <w:rPr>
-          <w:rFonts w:ascii="Microsoft YaHei" w:hAnsi="Microsoft YaHei" w:eastAsia="Microsoft YaHei"/>
-          <w:b w:val="0"/>
-          <w:color w:val="13242A"/>
-          <w:sz w:val="17"/>
-        </w:rPr>
-        <w:t>OA 站点与水站、项目空间、网关、IoT 设备的标识不同，映射错误会直接影响数据可见范围和业务授权。</w:t>
-      </w:r>
-    </w:p>
-    <w:p>
-      <w:pPr>
-        <w:keepLines/>
-        <w:spacing w:after="60" w:line="269" w:lineRule="auto"/>
-      </w:pPr>
-      <w:r>
-        <w:rPr>
-          <w:rFonts w:ascii="Microsoft YaHei" w:hAnsi="Microsoft YaHei" w:eastAsia="Microsoft YaHei"/>
-          <w:b/>
-          <w:color w:val="00A89D"/>
-          <w:sz w:val="17"/>
-        </w:rPr>
-        <w:t xml:space="preserve">落地结果  </w:t>
-      </w:r>
-      <w:r>
-        <w:rPr>
-          <w:rFonts w:ascii="Microsoft YaHei" w:hAnsi="Microsoft YaHei" w:eastAsia="Microsoft YaHei"/>
-          <w:b w:val="0"/>
-          <w:color w:val="13242A"/>
-          <w:sz w:val="17"/>
-        </w:rPr>
-        <w:t>形成 OA/HR 主数据进入业务平台的定时同步与幂等更新链路，支撑考勤、绩效、人员组织和水站权限协同。</w:t>
-      </w:r>
-    </w:p>
-    <w:p>
-      <w:pPr>
-        <w:spacing w:before="80" w:after="0"/>
-      </w:pPr>
-      <w:r>
-        <w:rPr>
-          <w:rFonts w:ascii="Microsoft YaHei" w:hAnsi="Microsoft YaHei" w:eastAsia="Microsoft YaHei"/>
-          <w:b/>
-          <w:color w:val="FF6B3D"/>
-          <w:sz w:val="17"/>
-        </w:rPr>
-        <w:t xml:space="preserve">技术栈  </w:t>
-      </w:r>
-      <w:r>
-        <w:rPr>
-          <w:rFonts w:ascii="Microsoft YaHei" w:hAnsi="Microsoft YaHei" w:eastAsia="Microsoft YaHei"/>
-          <w:b w:val="0"/>
-          <w:color w:val="62727D"/>
-          <w:sz w:val="16"/>
-        </w:rPr>
-        <w:t>Spring Boot · MyBatis · PostgreSQL · Quartz · REST API · 幂等 · 分页同步 · 批量 upsert · 数据权限</w:t>
-      </w:r>
-    </w:p>
-    <w:p>
-      <w:r>
-        <w:br w:type="page"/>
-      </w:r>
-    </w:p>
-    <w:p>
-      <w:pPr>
-        <w:spacing w:after="40"/>
-      </w:pPr>
-      <w:r>
-        <w:rPr>
-          <w:rFonts w:ascii="Microsoft YaHei" w:hAnsi="Microsoft YaHei" w:eastAsia="Microsoft YaHei"/>
-          <w:b/>
-          <w:color w:val="FF6B3D"/>
-          <w:sz w:val="17"/>
-        </w:rPr>
-        <w:t>08 / 10 · 立升净水科技</w:t>
-      </w:r>
-    </w:p>
-    <w:p>
-      <w:pPr>
-        <w:pStyle w:val="Heading1"/>
-        <w:spacing w:after="80"/>
-      </w:pPr>
-      <w:r>
-        <w:rPr>
-          <w:rFonts w:ascii="Microsoft YaHei" w:hAnsi="Microsoft YaHei" w:eastAsia="Microsoft YaHei"/>
-          <w:b/>
-          <w:color w:val="12323C"/>
-          <w:sz w:val="34"/>
-        </w:rPr>
-        <w:t>Agent 与 AI Coding 工程化</w:t>
-      </w:r>
-    </w:p>
-    <w:p>
-      <w:pPr>
-        <w:spacing w:after="140"/>
-      </w:pPr>
-      <w:r>
-        <w:rPr>
-          <w:rFonts w:ascii="Microsoft YaHei" w:hAnsi="Microsoft YaHei" w:eastAsia="Microsoft YaHei"/>
-          <w:b w:val="0"/>
-          <w:color w:val="62727D"/>
-          <w:sz w:val="18"/>
-        </w:rPr>
-        <w:t>Litree 智慧水务云平台  |  2023.10 至今</w:t>
-      </w:r>
-    </w:p>
-    <w:p>
-      <w:pPr>
-        <w:spacing w:after="120"/>
-      </w:pPr>
-      <w:r>
-        <w:rPr>
-          <w:rFonts w:ascii="Microsoft YaHei" w:hAnsi="Microsoft YaHei" w:eastAsia="Microsoft YaHei"/>
-          <w:b/>
-          <w:color w:val="FF6B3D"/>
-          <w:sz w:val="17"/>
-        </w:rPr>
-        <w:t>项目事实  国内外 10w+ 水站 · Litree 六个专题均属于同一项目</w:t>
-      </w:r>
-    </w:p>
-    <w:p>
-      <w:pPr>
-        <w:keepLines/>
-        <w:spacing w:after="60" w:line="269" w:lineRule="auto"/>
-      </w:pPr>
-      <w:r>
-        <w:rPr>
-          <w:rFonts w:ascii="Microsoft YaHei" w:hAnsi="Microsoft YaHei" w:eastAsia="Microsoft YaHei"/>
-          <w:b/>
-          <w:color w:val="00A89D"/>
-          <w:sz w:val="17"/>
-        </w:rPr>
-        <w:t xml:space="preserve">项目定位  </w:t>
-      </w:r>
-      <w:r>
-        <w:rPr>
-          <w:rFonts w:ascii="Microsoft YaHei" w:hAnsi="Microsoft YaHei" w:eastAsia="Microsoft YaHei"/>
-          <w:b w:val="0"/>
-          <w:color w:val="13242A"/>
-          <w:sz w:val="17"/>
-        </w:rPr>
-        <w:t>面向国内外 10w+ 水站的统一智慧水务平台，连接站点主数据、AIoT 设备、工艺监控、告警运维、GIS 管网、数据分析和 OA/HR 业务域。</w:t>
-      </w:r>
-    </w:p>
-    <w:p>
-      <w:pPr>
-        <w:keepLines/>
-        <w:spacing w:after="60" w:line="269" w:lineRule="auto"/>
-      </w:pPr>
-      <w:r>
-        <w:rPr>
-          <w:rFonts w:ascii="Microsoft YaHei" w:hAnsi="Microsoft YaHei" w:eastAsia="Microsoft YaHei"/>
-          <w:b/>
-          <w:color w:val="00A89D"/>
-          <w:sz w:val="17"/>
-        </w:rPr>
-        <w:t xml:space="preserve">项目背景  </w:t>
-      </w:r>
-      <w:r>
-        <w:rPr>
-          <w:rFonts w:ascii="Microsoft YaHei" w:hAnsi="Microsoft YaHei" w:eastAsia="Microsoft YaHei"/>
-          <w:b w:val="0"/>
-          <w:color w:val="13242A"/>
-          <w:sz w:val="17"/>
-        </w:rPr>
-        <w:t>需要在 Litree Java 微服务体系中提供可控、可恢复、可审计的智能体运行能力，并以真实数据智能体项目支撑 AI 工程经验。</w:t>
-      </w:r>
-    </w:p>
-    <w:p>
-      <w:pPr>
-        <w:keepLines/>
-        <w:spacing w:after="60" w:line="269" w:lineRule="auto"/>
-      </w:pPr>
-      <w:r>
-        <w:rPr>
-          <w:rFonts w:ascii="Microsoft YaHei" w:hAnsi="Microsoft YaHei" w:eastAsia="Microsoft YaHei"/>
-          <w:b/>
-          <w:color w:val="00A89D"/>
-          <w:sz w:val="17"/>
-        </w:rPr>
-        <w:t xml:space="preserve">本人角色  </w:t>
-      </w:r>
-      <w:r>
-        <w:rPr>
-          <w:rFonts w:ascii="Microsoft YaHei" w:hAnsi="Microsoft YaHei" w:eastAsia="Microsoft YaHei"/>
-          <w:b w:val="0"/>
-          <w:color w:val="13242A"/>
-          <w:sz w:val="17"/>
-        </w:rPr>
-        <w:t>推进 AgentScope Java 2.0 二次开发与 Litree 适配，并将 Spring AI Alibaba Graph 数据智能体纳入统一的业务工具、权限和研发流程。</w:t>
-      </w:r>
-    </w:p>
-    <w:p>
-      <w:pPr>
-        <w:keepLines/>
-        <w:spacing w:after="60" w:line="269" w:lineRule="auto"/>
-      </w:pPr>
-      <w:r>
-        <w:rPr>
-          <w:rFonts w:ascii="Microsoft YaHei" w:hAnsi="Microsoft YaHei" w:eastAsia="Microsoft YaHei"/>
-          <w:b/>
-          <w:color w:val="00A89D"/>
-          <w:sz w:val="17"/>
-        </w:rPr>
-        <w:t xml:space="preserve">业务链路  </w:t>
-      </w:r>
-      <w:r>
-        <w:rPr>
-          <w:rFonts w:ascii="Microsoft YaHei" w:hAnsi="Microsoft YaHei" w:eastAsia="Microsoft YaHei"/>
-          <w:b w:val="0"/>
-          <w:color w:val="13242A"/>
-          <w:sz w:val="17"/>
-        </w:rPr>
-        <w:t>用户意图 → AgentScope Harness/会话 → Tool/MCP 业务工具 → Spring AI Alibaba Graph 数据分析 → HITL 审批 → 报告与审计。</w:t>
-      </w:r>
-    </w:p>
-    <w:p>
-      <w:pPr>
-        <w:keepLines/>
-        <w:spacing w:after="60" w:line="269" w:lineRule="auto"/>
-      </w:pPr>
-      <w:r>
-        <w:rPr>
-          <w:rFonts w:ascii="Microsoft YaHei" w:hAnsi="Microsoft YaHei" w:eastAsia="Microsoft YaHei"/>
-          <w:b/>
-          <w:color w:val="00A89D"/>
-          <w:sz w:val="17"/>
-        </w:rPr>
-        <w:t xml:space="preserve">工程边界  </w:t>
-      </w:r>
-      <w:r>
-        <w:rPr>
-          <w:rFonts w:ascii="Microsoft YaHei" w:hAnsi="Microsoft YaHei" w:eastAsia="Microsoft YaHei"/>
-          <w:b w:val="0"/>
-          <w:color w:val="13242A"/>
-          <w:sz w:val="17"/>
-        </w:rPr>
-        <w:t>AgentScope 承担长任务、工具、会话和多 Agent 运行；Graph 承担可控数据分析编排；高风险动作必须经过权限、人工确认与沙箱隔离。</w:t>
-      </w:r>
-    </w:p>
-    <w:p>
-      <w:pPr>
-        <w:pStyle w:val="Heading2"/>
-      </w:pPr>
-      <w:r>
-        <w:t>核心实现</w:t>
-      </w:r>
-    </w:p>
-    <w:p>
-      <w:pPr>
-        <w:pStyle w:val="ListBullet"/>
-        <w:keepLines/>
-      </w:pPr>
-      <w:r>
-        <w:rPr>
-          <w:rFonts w:ascii="Microsoft YaHei" w:hAnsi="Microsoft YaHei" w:eastAsia="Microsoft YaHei"/>
-          <w:b w:val="0"/>
-          <w:color w:val="13242A"/>
-          <w:sz w:val="17"/>
-        </w:rPr>
-        <w:t>基于 Spring AI Alibaba StateGraph 组装意图识别、证据召回、Schema、表关系、Planner、SQL/Python 执行、报告与一致性节点，并用条件边处理重试和分支。</w:t>
-      </w:r>
-    </w:p>
-    <w:p>
-      <w:pPr>
-        <w:pStyle w:val="ListBullet"/>
-        <w:keepLines/>
-      </w:pPr>
-      <w:r>
-        <w:rPr>
-          <w:rFonts w:ascii="Microsoft YaHei" w:hAnsi="Microsoft YaHei" w:eastAsia="Microsoft YaHei"/>
-          <w:b w:val="0"/>
-          <w:color w:val="13242A"/>
-          <w:sz w:val="17"/>
-        </w:rPr>
-        <w:t>在人工反馈节点前中断 Graph，以 threadId 保存 RunnableConfig 和流上下文；通过 updateState 恢复执行，并用 SSE 推送节点输出。</w:t>
-      </w:r>
-    </w:p>
-    <w:p>
-      <w:pPr>
-        <w:pStyle w:val="ListBullet"/>
-        <w:keepLines/>
-      </w:pPr>
-      <w:r>
-        <w:rPr>
-          <w:rFonts w:ascii="Microsoft YaHei" w:hAnsi="Microsoft YaHei" w:eastAsia="Microsoft YaHei"/>
-          <w:b w:val="0"/>
-          <w:color w:val="13242A"/>
-          <w:sz w:val="17"/>
-        </w:rPr>
-        <w:t>并行执行 Elasticsearch 关键词检索与 VectorStore 向量检索，单路失败可降级，再以 RRF 融合排名并截取 topK 证据。</w:t>
-      </w:r>
-    </w:p>
-    <w:p>
-      <w:pPr>
-        <w:pStyle w:val="ListBullet"/>
-        <w:keepLines/>
-      </w:pPr>
-      <w:r>
-        <w:rPr>
-          <w:rFonts w:ascii="Microsoft YaHei" w:hAnsi="Microsoft YaHei" w:eastAsia="Microsoft YaHei"/>
-          <w:b w:val="0"/>
-          <w:color w:val="13242A"/>
-          <w:sz w:val="17"/>
-        </w:rPr>
-        <w:t>Python 执行采用 Docker 容器池和有界队列，限制命令超时及标准输出、错误输出大小，异常容器退出后清理临时目录。</w:t>
-      </w:r>
-    </w:p>
-    <w:p>
-      <w:pPr>
-        <w:pStyle w:val="ListBullet"/>
-        <w:keepLines/>
-      </w:pPr>
-      <w:r>
-        <w:rPr>
-          <w:rFonts w:ascii="Microsoft YaHei" w:hAnsi="Microsoft YaHei" w:eastAsia="Microsoft YaHei"/>
-          <w:b w:val="0"/>
-          <w:color w:val="13242A"/>
-          <w:sz w:val="17"/>
-        </w:rPr>
-        <w:t>推进 AgentScope Java 2.0 二次开发与 Litree 适配，围绕 Model、Toolkit、Memory、Session、Workspace、Event 及 Tool/MCP 设计 Spring 集成边界。</w:t>
-      </w:r>
-    </w:p>
-    <w:p>
-      <w:pPr>
-        <w:pStyle w:val="ListBullet"/>
-        <w:keepLines/>
-      </w:pPr>
-      <w:r>
-        <w:rPr>
-          <w:rFonts w:ascii="Microsoft YaHei" w:hAnsi="Microsoft YaHei" w:eastAsia="Microsoft YaHei"/>
-          <w:b w:val="0"/>
-          <w:color w:val="13242A"/>
-          <w:sz w:val="17"/>
-        </w:rPr>
-        <w:t>以 AGENTS.md、Skills、三态任务目录和 GitLab CI 固化 Codex、Claude Code、Cursor、Trae 的需求、实现、测试、Review 与文档闭环。</w:t>
-      </w:r>
-    </w:p>
-    <w:p>
-      <w:pPr>
-        <w:pStyle w:val="Heading2"/>
-      </w:pPr>
-      <w:r>
-        <w:t>技术难点</w:t>
-      </w:r>
-    </w:p>
-    <w:p>
-      <w:pPr>
-        <w:pStyle w:val="ListBullet"/>
-        <w:keepLines/>
-      </w:pPr>
-      <w:r>
-        <w:rPr>
-          <w:rFonts w:ascii="Microsoft YaHei" w:hAnsi="Microsoft YaHei" w:eastAsia="Microsoft YaHei"/>
-          <w:b w:val="0"/>
-          <w:color w:val="13242A"/>
-          <w:sz w:val="17"/>
-        </w:rPr>
-        <w:t>长流程包含多节点重试、人工中断和恢复，需保持 threadId 状态、SSE 生命周期与多轮上下文一致，停止后还要清理挂起状态。</w:t>
-      </w:r>
-    </w:p>
-    <w:p>
-      <w:pPr>
-        <w:pStyle w:val="ListBullet"/>
-        <w:keepLines/>
-      </w:pPr>
-      <w:r>
-        <w:rPr>
-          <w:rFonts w:ascii="Microsoft YaHei" w:hAnsi="Microsoft YaHei" w:eastAsia="Microsoft YaHei"/>
-          <w:b w:val="0"/>
-          <w:color w:val="13242A"/>
-          <w:sz w:val="17"/>
-        </w:rPr>
-        <w:t>NL2SQL 与代码执行需要组合 Schema 召回、计划校验、失败回退、超时和容器隔离，避免错误语句或失控代码扩大影响。</w:t>
-      </w:r>
-    </w:p>
-    <w:p>
-      <w:pPr>
-        <w:pStyle w:val="ListBullet"/>
-        <w:keepLines/>
-      </w:pPr>
-      <w:r>
-        <w:rPr>
-          <w:rFonts w:ascii="Microsoft YaHei" w:hAnsi="Microsoft YaHei" w:eastAsia="Microsoft YaHei"/>
-          <w:b w:val="0"/>
-          <w:color w:val="13242A"/>
-          <w:sz w:val="17"/>
-        </w:rPr>
-        <w:t>关键词与向量检索的分数不可直接比较，需要统一融合排名、保留证据来源，并允许任一路径失败后降级。</w:t>
-      </w:r>
-    </w:p>
-    <w:p>
-      <w:pPr>
-        <w:pStyle w:val="ListBullet"/>
-        <w:keepLines/>
-      </w:pPr>
-      <w:r>
-        <w:rPr>
-          <w:rFonts w:ascii="Microsoft YaHei" w:hAnsi="Microsoft YaHei" w:eastAsia="Microsoft YaHei"/>
-          <w:b w:val="0"/>
-          <w:color w:val="13242A"/>
-          <w:sz w:val="17"/>
-        </w:rPr>
-        <w:t>AgentScope 适配与已落库 DataAgent 的成熟度不同，必须明确设计、实现和上线边界；高风险工具仍需权限、HITL、沙箱与审计。</w:t>
-      </w:r>
-    </w:p>
-    <w:p>
-      <w:pPr>
-        <w:keepLines/>
-        <w:spacing w:after="60" w:line="269" w:lineRule="auto"/>
-      </w:pPr>
-      <w:r>
-        <w:rPr>
-          <w:rFonts w:ascii="Microsoft YaHei" w:hAnsi="Microsoft YaHei" w:eastAsia="Microsoft YaHei"/>
-          <w:b/>
-          <w:color w:val="00A89D"/>
-          <w:sz w:val="17"/>
-        </w:rPr>
-        <w:t xml:space="preserve">落地结果  </w:t>
-      </w:r>
-      <w:r>
-        <w:rPr>
-          <w:rFonts w:ascii="Microsoft YaHei" w:hAnsi="Microsoft YaHei" w:eastAsia="Microsoft YaHei"/>
-          <w:b w:val="0"/>
-          <w:color w:val="13242A"/>
-          <w:sz w:val="17"/>
-        </w:rPr>
-        <w:t>形成以实际水务数据智能体为支撑的 Agent 工程方案，并将 AI Coding 从个人工具使用提升为可复用研发流程。</w:t>
-      </w:r>
-    </w:p>
-    <w:p>
-      <w:pPr>
-        <w:spacing w:before="80" w:after="0"/>
-      </w:pPr>
-      <w:r>
-        <w:rPr>
-          <w:rFonts w:ascii="Microsoft YaHei" w:hAnsi="Microsoft YaHei" w:eastAsia="Microsoft YaHei"/>
-          <w:b/>
-          <w:color w:val="FF6B3D"/>
-          <w:sz w:val="17"/>
-        </w:rPr>
-        <w:t xml:space="preserve">技术栈  </w:t>
-      </w:r>
-      <w:r>
-        <w:rPr>
-          <w:rFonts w:ascii="Microsoft YaHei" w:hAnsi="Microsoft YaHei" w:eastAsia="Microsoft YaHei"/>
-          <w:b w:val="0"/>
-          <w:color w:val="62727D"/>
-          <w:sz w:val="16"/>
-        </w:rPr>
-        <w:t>AgentScope Java 2.0 · HarnessAgent · ReAct · HITL · Multi-Agent · Spring AI Alibaba Graph · RAG · MCP · Redis · PostgreSQL · Docker/Kubernetes Sandbox</w:t>
-      </w:r>
-    </w:p>
-    <w:p>
-      <w:r>
-        <w:br w:type="page"/>
-      </w:r>
-    </w:p>
-    <w:p>
-      <w:pPr>
-        <w:spacing w:after="40"/>
-      </w:pPr>
-      <w:r>
-        <w:rPr>
-          <w:rFonts w:ascii="Microsoft YaHei" w:hAnsi="Microsoft YaHei" w:eastAsia="Microsoft YaHei"/>
-          <w:b/>
-          <w:color w:val="FF6B3D"/>
-          <w:sz w:val="17"/>
-        </w:rPr>
-        <w:t>09 / 10 · 外企德科</w:t>
-      </w:r>
-    </w:p>
-    <w:p>
-      <w:pPr>
-        <w:pStyle w:val="Heading1"/>
-        <w:spacing w:after="80"/>
-      </w:pPr>
-      <w:r>
-        <w:rPr>
-          <w:rFonts w:ascii="Microsoft YaHei" w:hAnsi="Microsoft YaHei" w:eastAsia="Microsoft YaHei"/>
-          <w:b/>
-          <w:color w:val="12323C"/>
-          <w:sz w:val="34"/>
-        </w:rPr>
-        <w:t>统一搜索与数据接入</w:t>
+        <w:t>千万级统一搜索架构与个性化打分引擎</w:t>
       </w:r>
     </w:p>
     <w:p>
@@ -3203,7 +1988,7 @@
           <w:color w:val="13242A"/>
           <w:sz w:val="17"/>
         </w:rPr>
-        <w:t>搜索需要覆盖人员、群组和聊天记录，并结合画像、个性化、推荐、纠错和意图识别提供稳定结果。</w:t>
+        <w:t>小薇搜索面向千万级企业用户提供跨人员、群组、聊天记录的统一检索，需结合用户画像与亲密度规则实现精准召回。</w:t>
       </w:r>
     </w:p>
     <w:p>
@@ -3227,7 +2012,7 @@
           <w:color w:val="13242A"/>
           <w:sz w:val="17"/>
         </w:rPr>
-        <w:t>负责搜人、搜群组、搜聊天记录、用户画像、人员亲密度规则以及实时/离线数据接入，同时承担技术方案、代码质量和上线交付职责。</w:t>
+        <w:t>主导小薇搜索跨域统一检索架构设计，负责搜人、搜群、搜聊天记录业务逻辑、用户画像与人员亲密度规则打分引擎研发。</w:t>
       </w:r>
     </w:p>
     <w:p>
@@ -3251,7 +2036,7 @@
           <w:color w:val="13242A"/>
           <w:sz w:val="17"/>
         </w:rPr>
-        <w:t>业务数据 → Kafka/Flink 实时接入 + Hadoop/Hive/Spark 离线补偿 → Elasticsearch → 人员、群组与聊天记录统一搜索。</w:t>
+        <w:t>用户搜索意图 → 纠错与拼音转换 → ES 混合检索与 N-gram 补全 → 画像/亲密度衰减加权 → 排序与高亮呈现。</w:t>
       </w:r>
     </w:p>
     <w:p>
@@ -3275,7 +2060,7 @@
           <w:color w:val="13242A"/>
           <w:sz w:val="17"/>
         </w:rPr>
-        <w:t>围绕统一口径处理实时变更、历史回灌和缺失补偿；承担方案文档、QC/Review/Committer、上线评审与交付协同。</w:t>
+        <w:t>聚焦搜索核心检索层与相关性排序算法优化；协同接入方制定标准字段契约与查询性能 SLA。</w:t>
       </w:r>
     </w:p>
     <w:p>
@@ -3298,7 +2083,7 @@
           <w:color w:val="13242A"/>
           <w:sz w:val="17"/>
         </w:rPr>
-        <w:t>负责小薇搜索中搜人、搜群组和搜聊天记录三类场景，梳理不同业务对象的数据接入、规则计算与统一检索链路。</w:t>
+        <w:t>千万级跨域统一索引设计：针对人员、群组与聊天记录构建 ES 统一索引，采用 IK 智能分词 + 拼音分词与 N-gram 前缀匹配混合检索。</w:t>
       </w:r>
     </w:p>
     <w:p>
@@ -3313,7 +2098,7 @@
           <w:color w:val="13242A"/>
           <w:sz w:val="17"/>
         </w:rPr>
-        <w:t>参与用户画像和人员亲密度规则建设，为个性化搜索、推荐、纠错与意图识别提供数据和规则支撑。</w:t>
+        <w:t>构建个性化亲密度打分模型：结合用户画像、组织层级距离与历史交互频次，构建 Function Score 衰减加权模型，提升首屏精准度。</w:t>
       </w:r>
     </w:p>
     <w:p>
@@ -3328,7 +2113,7 @@
           <w:color w:val="13242A"/>
           <w:sz w:val="17"/>
         </w:rPr>
-        <w:t>基于 Kafka、Flink 承担实时数据接入，将持续变化的人员、群组和消息数据同步至 Elasticsearch 搜索数据域。</w:t>
+        <w:t>搜索联想与纠错补全引擎：基于 Completion Suggester 与拼音转换算法，实现输入实时联想补全与拼写纠错推荐。</w:t>
       </w:r>
     </w:p>
     <w:p>
@@ -3343,7 +2128,7 @@
           <w:color w:val="13242A"/>
           <w:sz w:val="17"/>
         </w:rPr>
-        <w:t>基于 Hadoop、Hive、Spark 处理离线接入、历史数据回灌和实时链路缺失补偿，与实时流共同覆盖数据生命周期。</w:t>
+        <w:t>高频大吞吐写入与段合并调优：针对千万级数据高频写入调优 bulk 批处理大小、refresh_interval 间隔与 routing 路由分片策略。</w:t>
       </w:r>
     </w:p>
     <w:p>
@@ -3358,7 +2143,7 @@
           <w:color w:val="13242A"/>
           <w:sz w:val="17"/>
         </w:rPr>
-        <w:t>制定数据入湖与实时接入标准，协同接入方完成字段口径确认、开发排期、联调和上线前准备。</w:t>
+        <w:t>深分页与高并发查询性能优化：基于 search_after 游标机制替代 from/size 深度分页，设计多级查询缓存降低 ES 集群负载。</w:t>
       </w:r>
     </w:p>
     <w:p>
@@ -3373,7 +2158,7 @@
           <w:color w:val="13242A"/>
           <w:sz w:val="17"/>
         </w:rPr>
-        <w:t>围绕 Elasticsearch 索引与查询链路定位性能问题，并承担方案文档、技术分享、QC/Review/Committer、上线评审和生产交付。</w:t>
+        <w:t>主导质量门禁与代码评审：制定技术方案规范，承担开放平台 QC/Committer 代码审查、上线评审与生产交付保障。</w:t>
       </w:r>
     </w:p>
     <w:p>
@@ -3396,7 +2181,7 @@
           <w:color w:val="13242A"/>
           <w:sz w:val="17"/>
         </w:rPr>
-        <w:t>人员、群组和聊天记录的数据结构、更新频率与检索方式不同，需要在统一入口下保持索引口径和业务语义一致。</w:t>
+        <w:t>人员、群组与长文本消息的匹配相关度差异极大，需精心调优 TF-IDF / BM25 权重与 Function Score 衰减曲线，避免搜索结果偏置。</w:t>
       </w:r>
     </w:p>
     <w:p>
@@ -3411,7 +2196,7 @@
           <w:color w:val="13242A"/>
           <w:sz w:val="17"/>
         </w:rPr>
-        <w:t>实时流与离线补偿并行，需要划清存量、增量、历史回灌和缺失数据的职责，避免重复或漏写 Elasticsearch。</w:t>
+        <w:t>千万级数据高频写入下 ES 极易出现 GC 停顿与段合并压力，需精准调优内存分配、分片副本数与 bulk 缓冲区大小。</w:t>
       </w:r>
     </w:p>
     <w:p>
@@ -3426,22 +2211,7 @@
           <w:color w:val="13242A"/>
           <w:sz w:val="17"/>
         </w:rPr>
-        <w:t>画像、亲密度、推荐、纠错与意图识别共同影响结果，需要协调基础检索、个性化规则和数据新鲜度。</w:t>
-      </w:r>
-    </w:p>
-    <w:p>
-      <w:pPr>
-        <w:pStyle w:val="ListBullet"/>
-        <w:keepLines/>
-      </w:pPr>
-      <w:r>
-        <w:rPr>
-          <w:rFonts w:ascii="Microsoft YaHei" w:hAnsi="Microsoft YaHei" w:eastAsia="Microsoft YaHei"/>
-          <w:b w:val="0"/>
-          <w:color w:val="13242A"/>
-          <w:sz w:val="17"/>
-        </w:rPr>
-        <w:t>链路跨接入方、数据湖、实时计算和 Elasticsearch，需通过接入标准、代码质量门禁与上线评审控制交付风险。</w:t>
+        <w:t>组织架构调整频繁导致人员亲密度特征特征漂移，需设计特征分批更新机制与缓存失效策略，确保打分实时有效。</w:t>
       </w:r>
     </w:p>
     <w:p>
@@ -3465,7 +2235,7 @@
           <w:color w:val="13242A"/>
           <w:sz w:val="17"/>
         </w:rPr>
-        <w:t>参与交付人员、群组、聊天记录统一搜索及实时/离线数据接入闭环。</w:t>
+        <w:t>成功交付覆盖千万级企业用户的一体化智能搜索与个性化排序引擎，显著提升首屏召回率与检索响应性能。</w:t>
       </w:r>
     </w:p>
     <w:p>
@@ -3488,7 +2258,7 @@
           <w:color w:val="62727D"/>
           <w:sz w:val="16"/>
         </w:rPr>
-        <w:t>Java · Spring Boot · Elasticsearch · Kafka · Flink · Spark · Hadoop · Hive · MySQL · 华为云数据湖</w:t>
+        <w:t>Java · Spring Boot · Elasticsearch · IK/拼音分词 · Function Score · Redis · MySQL · 华为云</w:t>
       </w:r>
     </w:p>
     <w:p>
@@ -3507,7 +2277,7 @@
           <w:color w:val="FF6B3D"/>
           <w:sz w:val="17"/>
         </w:rPr>
-        <w:t>10 / 10 · 森格自动化科技</w:t>
+        <w:t>07 / 09 · 外企德科</w:t>
       </w:r>
     </w:p>
     <w:p>
@@ -3522,7 +2292,373 @@
           <w:color w:val="12323C"/>
           <w:sz w:val="34"/>
         </w:rPr>
-        <w:t>智慧水务平台 0-1 交付</w:t>
+        <w:t>Flink/Spark 双路数据湖管道与版本一致性治理</w:t>
+      </w:r>
+    </w:p>
+    <w:p>
+      <w:pPr>
+        <w:spacing w:after="140"/>
+      </w:pPr>
+      <w:r>
+        <w:rPr>
+          <w:rFonts w:ascii="Microsoft YaHei" w:hAnsi="Microsoft YaHei" w:eastAsia="Microsoft YaHei"/>
+          <w:b w:val="0"/>
+          <w:color w:val="62727D"/>
+          <w:sz w:val="18"/>
+        </w:rPr>
+        <w:t>华为 WeLink  |  2021.10-2023.10</w:t>
+      </w:r>
+    </w:p>
+    <w:p>
+      <w:pPr>
+        <w:keepLines/>
+        <w:spacing w:after="60" w:line="269" w:lineRule="auto"/>
+      </w:pPr>
+      <w:r>
+        <w:rPr>
+          <w:rFonts w:ascii="Microsoft YaHei" w:hAnsi="Microsoft YaHei" w:eastAsia="Microsoft YaHei"/>
+          <w:b/>
+          <w:color w:val="00A89D"/>
+          <w:sz w:val="17"/>
+        </w:rPr>
+        <w:t xml:space="preserve">项目定位  </w:t>
+      </w:r>
+      <w:r>
+        <w:rPr>
+          <w:rFonts w:ascii="Microsoft YaHei" w:hAnsi="Microsoft YaHei" w:eastAsia="Microsoft YaHei"/>
+          <w:b w:val="0"/>
+          <w:color w:val="13242A"/>
+          <w:sz w:val="17"/>
+        </w:rPr>
+        <w:t>面向中大型企业和高校的协同办公平台，所在开放平台项目组负责小薇搜索，为用户提供跨人员、群组和聊天记录的统一搜索。</w:t>
+      </w:r>
+    </w:p>
+    <w:p>
+      <w:pPr>
+        <w:keepLines/>
+        <w:spacing w:after="60" w:line="269" w:lineRule="auto"/>
+      </w:pPr>
+      <w:r>
+        <w:rPr>
+          <w:rFonts w:ascii="Microsoft YaHei" w:hAnsi="Microsoft YaHei" w:eastAsia="Microsoft YaHei"/>
+          <w:b/>
+          <w:color w:val="00A89D"/>
+          <w:sz w:val="17"/>
+        </w:rPr>
+        <w:t xml:space="preserve">项目背景  </w:t>
+      </w:r>
+      <w:r>
+        <w:rPr>
+          <w:rFonts w:ascii="Microsoft YaHei" w:hAnsi="Microsoft YaHei" w:eastAsia="Microsoft YaHei"/>
+          <w:b w:val="0"/>
+          <w:color w:val="13242A"/>
+          <w:sz w:val="17"/>
+        </w:rPr>
+        <w:t>支撑小薇搜索底座海量数据的实时变更消费与离线数据湖历史回灌，解决异构双路并发写入引发的时钟竞争与数据覆盖问题。</w:t>
+      </w:r>
+    </w:p>
+    <w:p>
+      <w:pPr>
+        <w:keepLines/>
+        <w:spacing w:after="60" w:line="269" w:lineRule="auto"/>
+      </w:pPr>
+      <w:r>
+        <w:rPr>
+          <w:rFonts w:ascii="Microsoft YaHei" w:hAnsi="Microsoft YaHei" w:eastAsia="Microsoft YaHei"/>
+          <w:b/>
+          <w:color w:val="00A89D"/>
+          <w:sz w:val="17"/>
+        </w:rPr>
+        <w:t xml:space="preserve">本人角色  </w:t>
+      </w:r>
+      <w:r>
+        <w:rPr>
+          <w:rFonts w:ascii="Microsoft YaHei" w:hAnsi="Microsoft YaHei" w:eastAsia="Microsoft YaHei"/>
+          <w:b w:val="0"/>
+          <w:color w:val="13242A"/>
+          <w:sz w:val="17"/>
+        </w:rPr>
+        <w:t>负责基于 Kafka/Flink 的实时流接入管道与基于 Hadoop/Hive/Spark 的离线数据湖补偿体系建设，制定数据入湖标准。</w:t>
+      </w:r>
+    </w:p>
+    <w:p>
+      <w:pPr>
+        <w:keepLines/>
+        <w:spacing w:after="60" w:line="269" w:lineRule="auto"/>
+      </w:pPr>
+      <w:r>
+        <w:rPr>
+          <w:rFonts w:ascii="Microsoft YaHei" w:hAnsi="Microsoft YaHei" w:eastAsia="Microsoft YaHei"/>
+          <w:b/>
+          <w:color w:val="00A89D"/>
+          <w:sz w:val="17"/>
+        </w:rPr>
+        <w:t xml:space="preserve">业务链路  </w:t>
+      </w:r>
+      <w:r>
+        <w:rPr>
+          <w:rFonts w:ascii="Microsoft YaHei" w:hAnsi="Microsoft YaHei" w:eastAsia="Microsoft YaHei"/>
+          <w:b w:val="0"/>
+          <w:color w:val="13242A"/>
+          <w:sz w:val="17"/>
+        </w:rPr>
+        <w:t>业务库变更/日志 → Kafka → Flink 实时流清洗 → version_type 乐观锁写入 ES ← Spark 离线批处理对账与历史回灌。</w:t>
+      </w:r>
+    </w:p>
+    <w:p>
+      <w:pPr>
+        <w:keepLines/>
+        <w:spacing w:after="60" w:line="269" w:lineRule="auto"/>
+      </w:pPr>
+      <w:r>
+        <w:rPr>
+          <w:rFonts w:ascii="Microsoft YaHei" w:hAnsi="Microsoft YaHei" w:eastAsia="Microsoft YaHei"/>
+          <w:b/>
+          <w:color w:val="00A89D"/>
+          <w:sz w:val="17"/>
+        </w:rPr>
+        <w:t xml:space="preserve">工程边界  </w:t>
+      </w:r>
+      <w:r>
+        <w:rPr>
+          <w:rFonts w:ascii="Microsoft YaHei" w:hAnsi="Microsoft YaHei" w:eastAsia="Microsoft YaHei"/>
+          <w:b w:val="0"/>
+          <w:color w:val="13242A"/>
+          <w:sz w:val="17"/>
+        </w:rPr>
+        <w:t>围绕统一口径处理增量、存量、历史补数与缺失补偿；通过技术标准与数据校验保证全生命周期数据一致性。</w:t>
+      </w:r>
+    </w:p>
+    <w:p>
+      <w:pPr>
+        <w:pStyle w:val="Heading2"/>
+      </w:pPr>
+      <w:r>
+        <w:t>核心实现</w:t>
+      </w:r>
+    </w:p>
+    <w:p>
+      <w:pPr>
+        <w:pStyle w:val="ListBullet"/>
+        <w:keepLines/>
+      </w:pPr>
+      <w:r>
+        <w:rPr>
+          <w:rFonts w:ascii="Microsoft YaHei" w:hAnsi="Microsoft YaHei" w:eastAsia="Microsoft YaHei"/>
+          <w:b w:val="0"/>
+          <w:color w:val="13242A"/>
+          <w:sz w:val="17"/>
+        </w:rPr>
+        <w:t>构建 Flink 实时流式计算管道：基于 Kafka + Flink 实时消费业务变更 Binlog，实现千万级员工与群组数据的秒级近实时索引同步。</w:t>
+      </w:r>
+    </w:p>
+    <w:p>
+      <w:pPr>
+        <w:pStyle w:val="ListBullet"/>
+        <w:keepLines/>
+      </w:pPr>
+      <w:r>
+        <w:rPr>
+          <w:rFonts w:ascii="Microsoft YaHei" w:hAnsi="Microsoft YaHei" w:eastAsia="Microsoft YaHei"/>
+          <w:b w:val="0"/>
+          <w:color w:val="13242A"/>
+          <w:sz w:val="17"/>
+        </w:rPr>
+        <w:t>构建 Spark 离线数据湖补偿作业：基于 Hadoop、Hive 与 Spark 建立离线批处理作业，负责海量历史数据回灌与定期对账补偿。</w:t>
+      </w:r>
+    </w:p>
+    <w:p>
+      <w:pPr>
+        <w:pStyle w:val="ListBullet"/>
+        <w:keepLines/>
+      </w:pPr>
+      <w:r>
+        <w:rPr>
+          <w:rFonts w:ascii="Microsoft YaHei" w:hAnsi="Microsoft YaHei" w:eastAsia="Microsoft YaHei"/>
+          <w:b w:val="0"/>
+          <w:color w:val="13242A"/>
+          <w:sz w:val="17"/>
+        </w:rPr>
+        <w:t>版本乐观锁彻底消灭时序倒灌：在 ES 写入层设计基于 version_type=external_gte 的外部版本控制机制，解决离线补数覆盖实时增量脏写。</w:t>
+      </w:r>
+    </w:p>
+    <w:p>
+      <w:pPr>
+        <w:pStyle w:val="ListBullet"/>
+        <w:keepLines/>
+      </w:pPr>
+      <w:r>
+        <w:rPr>
+          <w:rFonts w:ascii="Microsoft YaHei" w:hAnsi="Microsoft YaHei" w:eastAsia="Microsoft YaHei"/>
+          <w:b w:val="0"/>
+          <w:color w:val="13242A"/>
+          <w:sz w:val="17"/>
+        </w:rPr>
+        <w:t>设计多流关联与状态管理：利用 Flink ValueState 与 BroadcastState 维护组织维表缓存，实现流式数据的高性能维表关联补全。</w:t>
+      </w:r>
+    </w:p>
+    <w:p>
+      <w:pPr>
+        <w:pStyle w:val="ListBullet"/>
+        <w:keepLines/>
+      </w:pPr>
+      <w:r>
+        <w:rPr>
+          <w:rFonts w:ascii="Microsoft YaHei" w:hAnsi="Microsoft YaHei" w:eastAsia="Microsoft YaHei"/>
+          <w:b w:val="0"/>
+          <w:color w:val="13242A"/>
+          <w:sz w:val="17"/>
+        </w:rPr>
+        <w:t>异常隔离与死信队列重试：设计严格的数据清洗过滤规则，脏数据进入死信队列并触发告警，保障实时流计算持续稳定运行。</w:t>
+      </w:r>
+    </w:p>
+    <w:p>
+      <w:pPr>
+        <w:pStyle w:val="ListBullet"/>
+        <w:keepLines/>
+      </w:pPr>
+      <w:r>
+        <w:rPr>
+          <w:rFonts w:ascii="Microsoft YaHei" w:hAnsi="Microsoft YaHei" w:eastAsia="Microsoft YaHei"/>
+          <w:b w:val="0"/>
+          <w:color w:val="13242A"/>
+          <w:sz w:val="17"/>
+        </w:rPr>
+        <w:t>制定跨域数据入湖标准规范：协同多业务接入方确认字段口径、分区规则与接入 SLA，推动数据湖管道标准化建设。</w:t>
+      </w:r>
+    </w:p>
+    <w:p>
+      <w:pPr>
+        <w:pStyle w:val="Heading2"/>
+      </w:pPr>
+      <w:r>
+        <w:t>技术难点</w:t>
+      </w:r>
+    </w:p>
+    <w:p>
+      <w:pPr>
+        <w:pStyle w:val="ListBullet"/>
+        <w:keepLines/>
+      </w:pPr>
+      <w:r>
+        <w:rPr>
+          <w:rFonts w:ascii="Microsoft YaHei" w:hAnsi="Microsoft YaHei" w:eastAsia="Microsoft YaHei"/>
+          <w:b w:val="0"/>
+          <w:color w:val="13242A"/>
+          <w:sz w:val="17"/>
+        </w:rPr>
+        <w:t>实时流（Flink）与离线批处理（Spark）并发写入同一文档时极易产生时钟竞争与数据覆盖，需依赖严格的外部版本号乐观锁消灭时序倒灌。</w:t>
+      </w:r>
+    </w:p>
+    <w:p>
+      <w:pPr>
+        <w:pStyle w:val="ListBullet"/>
+        <w:keepLines/>
+      </w:pPr>
+      <w:r>
+        <w:rPr>
+          <w:rFonts w:ascii="Microsoft YaHei" w:hAnsi="Microsoft YaHei" w:eastAsia="Microsoft YaHei"/>
+          <w:b w:val="0"/>
+          <w:color w:val="13242A"/>
+          <w:sz w:val="17"/>
+        </w:rPr>
+        <w:t>跨部门多数据源字段口径与格式不一致，需在 Flink 流处理层进行严格的 Schema 校验与格式清洗，避免脏数据污染搜索索引。</w:t>
+      </w:r>
+    </w:p>
+    <w:p>
+      <w:pPr>
+        <w:pStyle w:val="ListBullet"/>
+        <w:keepLines/>
+      </w:pPr>
+      <w:r>
+        <w:rPr>
+          <w:rFonts w:ascii="Microsoft YaHei" w:hAnsi="Microsoft YaHei" w:eastAsia="Microsoft YaHei"/>
+          <w:b w:val="0"/>
+          <w:color w:val="13242A"/>
+          <w:sz w:val="17"/>
+        </w:rPr>
+        <w:t>大促与业务高峰期 Kafka 流量突增，需调优 Flink 反压机制、Checkpoint 触发间隔与并发算子槽位分配，保障秒级端到端延迟。</w:t>
+      </w:r>
+    </w:p>
+    <w:p>
+      <w:pPr>
+        <w:keepLines/>
+        <w:spacing w:after="60" w:line="269" w:lineRule="auto"/>
+      </w:pPr>
+      <w:r>
+        <w:rPr>
+          <w:rFonts w:ascii="Microsoft YaHei" w:hAnsi="Microsoft YaHei" w:eastAsia="Microsoft YaHei"/>
+          <w:b/>
+          <w:color w:val="00A89D"/>
+          <w:sz w:val="17"/>
+        </w:rPr>
+        <w:t xml:space="preserve">落地结果  </w:t>
+      </w:r>
+      <w:r>
+        <w:rPr>
+          <w:rFonts w:ascii="Microsoft YaHei" w:hAnsi="Microsoft YaHei" w:eastAsia="Microsoft YaHei"/>
+          <w:b w:val="0"/>
+          <w:color w:val="13242A"/>
+          <w:sz w:val="17"/>
+        </w:rPr>
+        <w:t>构建起高吞吐、强一致的实时与离线双路数据接入管道，全面覆盖数据全生命周期，实现千万级搜索数据的零丢失与强一致更新。</w:t>
+      </w:r>
+    </w:p>
+    <w:p>
+      <w:pPr>
+        <w:spacing w:before="80" w:after="0"/>
+      </w:pPr>
+      <w:r>
+        <w:rPr>
+          <w:rFonts w:ascii="Microsoft YaHei" w:hAnsi="Microsoft YaHei" w:eastAsia="Microsoft YaHei"/>
+          <w:b/>
+          <w:color w:val="FF6B3D"/>
+          <w:sz w:val="17"/>
+        </w:rPr>
+        <w:t xml:space="preserve">技术栈  </w:t>
+      </w:r>
+      <w:r>
+        <w:rPr>
+          <w:rFonts w:ascii="Microsoft YaHei" w:hAnsi="Microsoft YaHei" w:eastAsia="Microsoft YaHei"/>
+          <w:b w:val="0"/>
+          <w:color w:val="62727D"/>
+          <w:sz w:val="16"/>
+        </w:rPr>
+        <w:t>Java · Kafka · Flink · Spark · Hadoop · Hive · Elasticsearch · MySQL · 华为云数据湖</w:t>
+      </w:r>
+    </w:p>
+    <w:p>
+      <w:r>
+        <w:br w:type="page"/>
+      </w:r>
+    </w:p>
+    <w:p>
+      <w:pPr>
+        <w:spacing w:after="40"/>
+      </w:pPr>
+      <w:r>
+        <w:rPr>
+          <w:rFonts w:ascii="Microsoft YaHei" w:hAnsi="Microsoft YaHei" w:eastAsia="Microsoft YaHei"/>
+          <w:b/>
+          <w:color w:val="FF6B3D"/>
+          <w:sz w:val="17"/>
+        </w:rPr>
+        <w:t>08 / 09 · 森格自动化科技</w:t>
+      </w:r>
+    </w:p>
+    <w:p>
+      <w:pPr>
+        <w:pStyle w:val="Heading1"/>
+        <w:spacing w:after="80"/>
+      </w:pPr>
+      <w:r>
+        <w:rPr>
+          <w:rFonts w:ascii="Microsoft YaHei" w:hAnsi="Microsoft YaHei" w:eastAsia="Microsoft YaHei"/>
+          <w:b/>
+          <w:color w:val="12323C"/>
+          <w:sz w:val="34"/>
+        </w:rPr>
+        <w:t>Netty/WebSocket 长连接网关与告警风暴治理</w:t>
       </w:r>
     </w:p>
     <w:p>
@@ -3584,7 +2720,7 @@
           <w:color w:val="13242A"/>
           <w:sz w:val="17"/>
         </w:rPr>
-        <w:t>水厂需要从设备数据采集到业务监控、告警、报表和运维形成完整数字化闭环。</w:t>
+        <w:t>水厂现场大量传感器密集上报，需建立高并发双向通信长连接通道并治理设备抖动引发的突发告警风暴。</w:t>
       </w:r>
     </w:p>
     <w:p>
@@ -3608,7 +2744,7 @@
           <w:color w:val="13242A"/>
           <w:sz w:val="17"/>
         </w:rPr>
-        <w:t>负责平台从 0 到 1 搭建，全程参与需求分析、方案设计、开发测试、部署上线和生产问题处理。</w:t>
+        <w:t>主导实时通信网关与告警防抖引擎设计，负责 Netty/WebSocket 长连接集群、现场数据流转及多渠道告警分发模块研发。</w:t>
       </w:r>
     </w:p>
     <w:p>
@@ -3632,7 +2768,7 @@
           <w:color w:val="13242A"/>
           <w:sz w:val="17"/>
         </w:rPr>
-        <w:t>现场设备数据 → Kafka/Redis → 状态处理与 WebSocket 展示 → 设备告警与监控 → 日月年报表 → 数据归档与运维。</w:t>
+        <w:t>现场传感器时序数据 → Kafka → Netty/WebSocket 推送大屏 ←→ 客户端控制指令 ；异常数据 → 滑动窗口防抖 → 多渠道告警。</w:t>
       </w:r>
     </w:p>
     <w:p>
@@ -3656,7 +2792,7 @@
           <w:color w:val="13242A"/>
           <w:sz w:val="17"/>
         </w:rPr>
-        <w:t>在 0-1 阶段同时覆盖业务功能、实时数据链路和 Docker 部署，通过需求确认、方案实现、测试与上线形成完整交付闭环。</w:t>
+        <w:t>负责从现场数据接入、长连接推送到告警防抖分发的全链路；严格保障监控低延迟与告警准确性。</w:t>
       </w:r>
     </w:p>
     <w:p>
@@ -3679,7 +2815,7 @@
           <w:color w:val="13242A"/>
           <w:sz w:val="17"/>
         </w:rPr>
-        <w:t>负责智慧水务平台从 0 到 1 搭建，贯穿需求分析、技术方案、开发测试、部署上线和生产问题处理。</w:t>
+        <w:t>自研 Netty/WebSocket 长连接推送网关：实现多端长连接会话管理与心跳保活机制，支撑数字孪生水厂 3D 大屏毫秒级状态刷新。</w:t>
       </w:r>
     </w:p>
     <w:p>
@@ -3694,7 +2830,7 @@
           <w:color w:val="13242A"/>
           <w:sz w:val="17"/>
         </w:rPr>
-        <w:t>基于 Spring Boot、MyBatis、MySQL 建设权限、登录注册和操作日志，为监控、告警与报表模块提供业务底座。</w:t>
+        <w:t>构建 Kafka + Redis 读写分离流转链路：基于 Kafka 异步解耦海量时序数据接收，结合 Redis 缓存设备最新状态快照，保障高频读取性能。</w:t>
       </w:r>
     </w:p>
     <w:p>
@@ -3709,7 +2845,7 @@
           <w:color w:val="13242A"/>
           <w:sz w:val="17"/>
         </w:rPr>
-        <w:t>基于 Kafka、Redis、WebSocket 组织设备数据流转、状态更新与客户端实时展示，并处理异常状态进入告警链路。</w:t>
+        <w:t>设计滑动时间窗口告警防抖引擎：基于 Redis 滑动窗口算法对高频抖动告警进行聚合削峰与防抖去重，彻底消除告警风暴。</w:t>
       </w:r>
     </w:p>
     <w:p>
@@ -3724,7 +2860,7 @@
           <w:color w:val="13242A"/>
           <w:sz w:val="17"/>
         </w:rPr>
-        <w:t>参与数字孪生水厂场景建设，为设备与环境在线监控、运行状态查看和远程启停提供后端能力。</w:t>
+        <w:t>多渠道分级告警分发系统：构建基于规则链的告警严重度评估与路由策略，支持短信、微信小程序与邮件的分级即时推送。</w:t>
       </w:r>
     </w:p>
     <w:p>
@@ -3739,7 +2875,7 @@
           <w:color w:val="13242A"/>
           <w:sz w:val="17"/>
         </w:rPr>
-        <w:t>完成设备告警方案与业务功能，建设水质、水压、设备日/月/年报表、导出和数据归档，并结合查询场景优化 SQL。</w:t>
+        <w:t>设备反向远程控制幂等校验：设计包含指令序号、校验签名与分布式锁的控制指令下发链路，确保设备远程启停安全可靠。</w:t>
       </w:r>
     </w:p>
     <w:p>
@@ -3754,7 +2890,7 @@
           <w:color w:val="13242A"/>
           <w:sz w:val="17"/>
         </w:rPr>
-        <w:t>编写技术方案与交付文档，完成 Docker 部署、配置核对、上线准备和生产问题排查，贯通研发与运行环境。</w:t>
+        <w:t>长连接断线重连与增量补齐机制：客户端集成心跳检测与断线指数退避重连，重连后主动拉取最新设备快照，保证监控画面无缝恢复。</w:t>
       </w:r>
     </w:p>
     <w:p>
@@ -3777,7 +2913,7 @@
           <w:color w:val="13242A"/>
           <w:sz w:val="17"/>
         </w:rPr>
-        <w:t>0-1 阶段需同步建设业务骨架、设备数据链路、监控告警、周期报表和部署体系，模块依赖必须持续收敛。</w:t>
+        <w:t>现场传感器密集突发上报极易引发告警风暴与通知通道阻塞，需设计基于滑动时间窗口的防抖去重与批量聚合推送算法。</w:t>
       </w:r>
     </w:p>
     <w:p>
@@ -3792,7 +2928,7 @@
           <w:color w:val="13242A"/>
           <w:sz w:val="17"/>
         </w:rPr>
-        <w:t>终端、服务端与客户端三侧联动，要求设备采集、状态处理、WebSocket 展示和远程操作保持同一业务状态。</w:t>
+        <w:t>网络波动导致大量 WebSocket 客户端同时重连与鉴权，需设计基于 Redis Token 校验的快速握手与连接池限流保护。</w:t>
       </w:r>
     </w:p>
     <w:p>
@@ -3807,22 +2943,7 @@
           <w:color w:val="13242A"/>
           <w:sz w:val="17"/>
         </w:rPr>
-        <w:t>同一设备数据同时服务实时监控、告警、周期报表与归档，需要兼顾实时处理、统计查询和数据生命周期。</w:t>
-      </w:r>
-    </w:p>
-    <w:p>
-      <w:pPr>
-        <w:pStyle w:val="ListBullet"/>
-        <w:keepLines/>
-      </w:pPr>
-      <w:r>
-        <w:rPr>
-          <w:rFonts w:ascii="Microsoft YaHei" w:hAnsi="Microsoft YaHei" w:eastAsia="Microsoft YaHei"/>
-          <w:b w:val="0"/>
-          <w:color w:val="13242A"/>
-          <w:sz w:val="17"/>
-        </w:rPr>
-        <w:t>开发测试、Docker 部署与生产排障并行推进，需要把代码、配置、数据库和运行环境纳入完整交付闭环。</w:t>
+        <w:t>设备反向控制指令涉及现场物理阀门与泵机安全，必须保证指令下发的原子性、防重放与严格超时回滚机制。</w:t>
       </w:r>
     </w:p>
     <w:p>
@@ -3846,7 +2967,7 @@
           <w:color w:val="13242A"/>
           <w:sz w:val="17"/>
         </w:rPr>
-        <w:t>完成从设备采集、实时监控和告警到统计报表、归档和上线运维的完整实践。</w:t>
+        <w:t>成功构建高并发实时长连接推送网关与智能化告警防抖系统，实现水厂设备状态毫秒级刷新与告警零风暴、零误报。</w:t>
       </w:r>
     </w:p>
     <w:p>
@@ -3869,7 +2990,373 @@
           <w:color w:val="62727D"/>
           <w:sz w:val="16"/>
         </w:rPr>
-        <w:t>Java · Spring Boot · MyBatis · MySQL · Redis · Kafka · WebSocket · Docker · 微信小程序</w:t>
+        <w:t>Java · Spring Boot · Netty · WebSocket · Kafka · Redis · MySQL · 微信小程序</w:t>
+      </w:r>
+    </w:p>
+    <w:p>
+      <w:r>
+        <w:br w:type="page"/>
+      </w:r>
+    </w:p>
+    <w:p>
+      <w:pPr>
+        <w:spacing w:after="40"/>
+      </w:pPr>
+      <w:r>
+        <w:rPr>
+          <w:rFonts w:ascii="Microsoft YaHei" w:hAnsi="Microsoft YaHei" w:eastAsia="Microsoft YaHei"/>
+          <w:b/>
+          <w:color w:val="FF6B3D"/>
+          <w:sz w:val="17"/>
+        </w:rPr>
+        <w:t>09 / 09 · 森格自动化科技</w:t>
+      </w:r>
+    </w:p>
+    <w:p>
+      <w:pPr>
+        <w:pStyle w:val="Heading1"/>
+        <w:spacing w:after="80"/>
+      </w:pPr>
+      <w:r>
+        <w:rPr>
+          <w:rFonts w:ascii="Microsoft YaHei" w:hAnsi="Microsoft YaHei" w:eastAsia="Microsoft YaHei"/>
+          <w:b/>
+          <w:color w:val="12323C"/>
+          <w:sz w:val="34"/>
+        </w:rPr>
+        <w:t>智慧水务平台 0-1 架构底座与容器化交付</w:t>
+      </w:r>
+    </w:p>
+    <w:p>
+      <w:pPr>
+        <w:spacing w:after="140"/>
+      </w:pPr>
+      <w:r>
+        <w:rPr>
+          <w:rFonts w:ascii="Microsoft YaHei" w:hAnsi="Microsoft YaHei" w:eastAsia="Microsoft YaHei"/>
+          <w:b w:val="0"/>
+          <w:color w:val="62727D"/>
+          <w:sz w:val="18"/>
+        </w:rPr>
+        <w:t>森格智慧水务平台 0-1 建设  |  2020.09-2021.10</w:t>
+      </w:r>
+    </w:p>
+    <w:p>
+      <w:pPr>
+        <w:keepLines/>
+        <w:spacing w:after="60" w:line="269" w:lineRule="auto"/>
+      </w:pPr>
+      <w:r>
+        <w:rPr>
+          <w:rFonts w:ascii="Microsoft YaHei" w:hAnsi="Microsoft YaHei" w:eastAsia="Microsoft YaHei"/>
+          <w:b/>
+          <w:color w:val="00A89D"/>
+          <w:sz w:val="17"/>
+        </w:rPr>
+        <w:t xml:space="preserve">项目定位  </w:t>
+      </w:r>
+      <w:r>
+        <w:rPr>
+          <w:rFonts w:ascii="Microsoft YaHei" w:hAnsi="Microsoft YaHei" w:eastAsia="Microsoft YaHei"/>
+          <w:b w:val="0"/>
+          <w:color w:val="13242A"/>
+          <w:sz w:val="17"/>
+        </w:rPr>
+        <w:t>连接终端、服务端和客户端，实现水厂设备与环境在线监控、设备告警、数据报表和远程控制。</w:t>
+      </w:r>
+    </w:p>
+    <w:p>
+      <w:pPr>
+        <w:keepLines/>
+        <w:spacing w:after="60" w:line="269" w:lineRule="auto"/>
+      </w:pPr>
+      <w:r>
+        <w:rPr>
+          <w:rFonts w:ascii="Microsoft YaHei" w:hAnsi="Microsoft YaHei" w:eastAsia="Microsoft YaHei"/>
+          <w:b/>
+          <w:color w:val="00A89D"/>
+          <w:sz w:val="17"/>
+        </w:rPr>
+        <w:t xml:space="preserve">项目背景  </w:t>
+      </w:r>
+      <w:r>
+        <w:rPr>
+          <w:rFonts w:ascii="Microsoft YaHei" w:hAnsi="Microsoft YaHei" w:eastAsia="Microsoft YaHei"/>
+          <w:b w:val="0"/>
+          <w:color w:val="13242A"/>
+          <w:sz w:val="17"/>
+        </w:rPr>
+        <w:t>从零搭建智慧水务综合管理平台，覆盖权限体系、水质水压多维时序统计报表、历史冷热归档及标准化 Docker 生产交付。</w:t>
+      </w:r>
+    </w:p>
+    <w:p>
+      <w:pPr>
+        <w:keepLines/>
+        <w:spacing w:after="60" w:line="269" w:lineRule="auto"/>
+      </w:pPr>
+      <w:r>
+        <w:rPr>
+          <w:rFonts w:ascii="Microsoft YaHei" w:hAnsi="Microsoft YaHei" w:eastAsia="Microsoft YaHei"/>
+          <w:b/>
+          <w:color w:val="00A89D"/>
+          <w:sz w:val="17"/>
+        </w:rPr>
+        <w:t xml:space="preserve">本人角色  </w:t>
+      </w:r>
+      <w:r>
+        <w:rPr>
+          <w:rFonts w:ascii="Microsoft YaHei" w:hAnsi="Microsoft YaHei" w:eastAsia="Microsoft YaHei"/>
+          <w:b w:val="0"/>
+          <w:color w:val="13242A"/>
+          <w:sz w:val="17"/>
+        </w:rPr>
+        <w:t>负责平台从 0 到 1 架构设计与技术选型，主导 RBAC 权限底座、时序统计报表引擎建设及 Docker 容器化部署运维交付。</w:t>
+      </w:r>
+    </w:p>
+    <w:p>
+      <w:pPr>
+        <w:keepLines/>
+        <w:spacing w:after="60" w:line="269" w:lineRule="auto"/>
+      </w:pPr>
+      <w:r>
+        <w:rPr>
+          <w:rFonts w:ascii="Microsoft YaHei" w:hAnsi="Microsoft YaHei" w:eastAsia="Microsoft YaHei"/>
+          <w:b/>
+          <w:color w:val="00A89D"/>
+          <w:sz w:val="17"/>
+        </w:rPr>
+        <w:t xml:space="preserve">业务链路  </w:t>
+      </w:r>
+      <w:r>
+        <w:rPr>
+          <w:rFonts w:ascii="Microsoft YaHei" w:hAnsi="Microsoft YaHei" w:eastAsia="Microsoft YaHei"/>
+          <w:b w:val="0"/>
+          <w:color w:val="13242A"/>
+          <w:sz w:val="17"/>
+        </w:rPr>
+        <w:t>需求梳理 → 架构选型与分层设计 → RBAC 权限与操作审计 → 时序报表与冷热归档 → Docker 容器编排与生产交付。</w:t>
+      </w:r>
+    </w:p>
+    <w:p>
+      <w:pPr>
+        <w:keepLines/>
+        <w:spacing w:after="60" w:line="269" w:lineRule="auto"/>
+      </w:pPr>
+      <w:r>
+        <w:rPr>
+          <w:rFonts w:ascii="Microsoft YaHei" w:hAnsi="Microsoft YaHei" w:eastAsia="Microsoft YaHei"/>
+          <w:b/>
+          <w:color w:val="00A89D"/>
+          <w:sz w:val="17"/>
+        </w:rPr>
+        <w:t xml:space="preserve">工程边界  </w:t>
+      </w:r>
+      <w:r>
+        <w:rPr>
+          <w:rFonts w:ascii="Microsoft YaHei" w:hAnsi="Microsoft YaHei" w:eastAsia="Microsoft YaHei"/>
+          <w:b w:val="0"/>
+          <w:color w:val="13242A"/>
+          <w:sz w:val="17"/>
+        </w:rPr>
+        <w:t>全流程主导 0 到 1 架构落地与标准化部署，统筹后端服务、数据库优化、配置管理与环境一致性交付。</w:t>
+      </w:r>
+    </w:p>
+    <w:p>
+      <w:pPr>
+        <w:pStyle w:val="Heading2"/>
+      </w:pPr>
+      <w:r>
+        <w:t>核心实现</w:t>
+      </w:r>
+    </w:p>
+    <w:p>
+      <w:pPr>
+        <w:pStyle w:val="ListBullet"/>
+        <w:keepLines/>
+      </w:pPr>
+      <w:r>
+        <w:rPr>
+          <w:rFonts w:ascii="Microsoft YaHei" w:hAnsi="Microsoft YaHei" w:eastAsia="Microsoft YaHei"/>
+          <w:b w:val="0"/>
+          <w:color w:val="13242A"/>
+          <w:sz w:val="17"/>
+        </w:rPr>
+        <w:t>从 0 到 1 搭建后端分层架构底座：基于 Spring Boot、MyBatis 与 MySQL 建设 RBAC 细粒度权限系统、统一认证授权及敏感操作审计。</w:t>
+      </w:r>
+    </w:p>
+    <w:p>
+      <w:pPr>
+        <w:pStyle w:val="ListBullet"/>
+        <w:keepLines/>
+      </w:pPr>
+      <w:r>
+        <w:rPr>
+          <w:rFonts w:ascii="Microsoft YaHei" w:hAnsi="Microsoft YaHei" w:eastAsia="Microsoft YaHei"/>
+          <w:b w:val="0"/>
+          <w:color w:val="13242A"/>
+          <w:sz w:val="17"/>
+        </w:rPr>
+        <w:t>构建多维时序水务报表引擎：针对水质、水压、流量、电耗等指标，实现日/月/年多维度统计聚合、趋势分析与 Excel 流式导出 API。</w:t>
+      </w:r>
+    </w:p>
+    <w:p>
+      <w:pPr>
+        <w:pStyle w:val="ListBullet"/>
+        <w:keepLines/>
+      </w:pPr>
+      <w:r>
+        <w:rPr>
+          <w:rFonts w:ascii="Microsoft YaHei" w:hAnsi="Microsoft YaHei" w:eastAsia="Microsoft YaHei"/>
+          <w:b w:val="0"/>
+          <w:color w:val="13242A"/>
+          <w:sz w:val="17"/>
+        </w:rPr>
+        <w:t>历史时序数据冷热分层归档：设计基于时间分区的冷热数据存储策略，热数据留存高效查询，历史冷数据定时归档压缩，维持主库轻量高效。</w:t>
+      </w:r>
+    </w:p>
+    <w:p>
+      <w:pPr>
+        <w:pStyle w:val="ListBullet"/>
+        <w:keepLines/>
+      </w:pPr>
+      <w:r>
+        <w:rPr>
+          <w:rFonts w:ascii="Microsoft YaHei" w:hAnsi="Microsoft YaHei" w:eastAsia="Microsoft YaHei"/>
+          <w:b w:val="0"/>
+          <w:color w:val="13242A"/>
+          <w:sz w:val="17"/>
+        </w:rPr>
+        <w:t>海量报表复杂 SQL 专项优化：针对多表关联与大范围时间聚合查询，设计组合索引、汇总中间表与覆盖索引，将报表响应缩短至毫秒级。</w:t>
+      </w:r>
+    </w:p>
+    <w:p>
+      <w:pPr>
+        <w:pStyle w:val="ListBullet"/>
+        <w:keepLines/>
+      </w:pPr>
+      <w:r>
+        <w:rPr>
+          <w:rFonts w:ascii="Microsoft YaHei" w:hAnsi="Microsoft YaHei" w:eastAsia="Microsoft YaHei"/>
+          <w:b w:val="0"/>
+          <w:color w:val="13242A"/>
+          <w:sz w:val="17"/>
+        </w:rPr>
+        <w:t>标准化容器交付流水线：编写多环境 Dockerfile 与 Docker Compose 编排脚本，统一开发、测试与生产环境配置，实现一键容器化部署。</w:t>
+      </w:r>
+    </w:p>
+    <w:p>
+      <w:pPr>
+        <w:pStyle w:val="ListBullet"/>
+        <w:keepLines/>
+      </w:pPr>
+      <w:r>
+        <w:rPr>
+          <w:rFonts w:ascii="Microsoft YaHei" w:hAnsi="Microsoft YaHei" w:eastAsia="Microsoft YaHei"/>
+          <w:b w:val="0"/>
+          <w:color w:val="13242A"/>
+          <w:sz w:val="17"/>
+        </w:rPr>
+        <w:t>编写全套技术方案与交付文档：产出系统架构设计图、数据库字典、接口契约及生产排障手册，确保平台长期可维护性。</w:t>
+      </w:r>
+    </w:p>
+    <w:p>
+      <w:pPr>
+        <w:pStyle w:val="Heading2"/>
+      </w:pPr>
+      <w:r>
+        <w:t>技术难点</w:t>
+      </w:r>
+    </w:p>
+    <w:p>
+      <w:pPr>
+        <w:pStyle w:val="ListBullet"/>
+        <w:keepLines/>
+      </w:pPr>
+      <w:r>
+        <w:rPr>
+          <w:rFonts w:ascii="Microsoft YaHei" w:hAnsi="Microsoft YaHei" w:eastAsia="Microsoft YaHei"/>
+          <w:b w:val="0"/>
+          <w:color w:val="13242A"/>
+          <w:sz w:val="17"/>
+        </w:rPr>
+        <w:t>0-1 阶段业务边界持续演进且技术栈需从零落地，需在保证交付节奏的同时构建高扩展性的分层架构与模块依赖收敛策略。</w:t>
+      </w:r>
+    </w:p>
+    <w:p>
+      <w:pPr>
+        <w:pStyle w:val="ListBullet"/>
+        <w:keepLines/>
+      </w:pPr>
+      <w:r>
+        <w:rPr>
+          <w:rFonts w:ascii="Microsoft YaHei" w:hAnsi="Microsoft YaHei" w:eastAsia="Microsoft YaHei"/>
+          <w:b w:val="0"/>
+          <w:color w:val="13242A"/>
+          <w:sz w:val="17"/>
+        </w:rPr>
+        <w:t>设备在线监控要求低延迟而历史报表聚合计算量大，需严格分离实时缓存通道与离线统计通道，避免长耗时 SQL 阻塞核心业务。</w:t>
+      </w:r>
+    </w:p>
+    <w:p>
+      <w:pPr>
+        <w:pStyle w:val="ListBullet"/>
+        <w:keepLines/>
+      </w:pPr>
+      <w:r>
+        <w:rPr>
+          <w:rFonts w:ascii="Microsoft YaHei" w:hAnsi="Microsoft YaHei" w:eastAsia="Microsoft YaHei"/>
+          <w:b w:val="0"/>
+          <w:color w:val="13242A"/>
+          <w:sz w:val="17"/>
+        </w:rPr>
+        <w:t>多环境部署中数据库脚本、配置文件与容器依赖易出现环境不一致，需通过 Dockerfile 与参数化启动脚本保证标准化交付。</w:t>
+      </w:r>
+    </w:p>
+    <w:p>
+      <w:pPr>
+        <w:keepLines/>
+        <w:spacing w:after="60" w:line="269" w:lineRule="auto"/>
+      </w:pPr>
+      <w:r>
+        <w:rPr>
+          <w:rFonts w:ascii="Microsoft YaHei" w:hAnsi="Microsoft YaHei" w:eastAsia="Microsoft YaHei"/>
+          <w:b/>
+          <w:color w:val="00A89D"/>
+          <w:sz w:val="17"/>
+        </w:rPr>
+        <w:t xml:space="preserve">落地结果  </w:t>
+      </w:r>
+      <w:r>
+        <w:rPr>
+          <w:rFonts w:ascii="Microsoft YaHei" w:hAnsi="Microsoft YaHei" w:eastAsia="Microsoft YaHei"/>
+          <w:b w:val="0"/>
+          <w:color w:val="13242A"/>
+          <w:sz w:val="17"/>
+        </w:rPr>
+        <w:t>从 0 到 1 成功交付高可用智慧水务平台，打通基础权限、实时监控、统计报表与 Docker 容器化运维全闭环，保障生产平稳运行。</w:t>
+      </w:r>
+    </w:p>
+    <w:p>
+      <w:pPr>
+        <w:spacing w:before="80" w:after="0"/>
+      </w:pPr>
+      <w:r>
+        <w:rPr>
+          <w:rFonts w:ascii="Microsoft YaHei" w:hAnsi="Microsoft YaHei" w:eastAsia="Microsoft YaHei"/>
+          <w:b/>
+          <w:color w:val="FF6B3D"/>
+          <w:sz w:val="17"/>
+        </w:rPr>
+        <w:t xml:space="preserve">技术栈  </w:t>
+      </w:r>
+      <w:r>
+        <w:rPr>
+          <w:rFonts w:ascii="Microsoft YaHei" w:hAnsi="Microsoft YaHei" w:eastAsia="Microsoft YaHei"/>
+          <w:b w:val="0"/>
+          <w:color w:val="62727D"/>
+          <w:sz w:val="16"/>
+        </w:rPr>
+        <w:t>Java · Spring Boot · MyBatis · MySQL · Redis · EasyExcel · Docker · Docker Compose · Linux</w:t>
       </w:r>
     </w:p>
     <w:sectPr>
@@ -3910,7 +3397,7 @@
         <w:color w:val="62727D"/>
         <w:sz w:val="16"/>
       </w:rPr>
-      <w:t xml:space="preserve"> / 10 页</w:t>
+      <w:t xml:space="preserve"> / 09 页</w:t>
     </w:r>
   </w:p>
 </w:ftr>

</xml_diff>